<commit_message>
RIP Protocal Practical Performed
</commit_message>
<xml_diff>
--- a/ASSIGNMENT/Assignment_No07.docx
+++ b/ASSIGNMENT/Assignment_No07.docx
@@ -1,6 +1,6 @@
 
 <file path=word/document.xml><?xml version="1.0" encoding="utf-8"?>
-<w:document xmlns:ve="http://schemas.openxmlformats.org/markup-compatibility/2006" xmlns:o="urn:schemas-microsoft-com:office:office" xmlns:r="http://schemas.openxmlformats.org/officeDocument/2006/relationships" xmlns:m="http://schemas.openxmlformats.org/officeDocument/2006/math" xmlns:v="urn:schemas-microsoft-com:vml" xmlns:wp="http://schemas.openxmlformats.org/drawingml/2006/wordprocessingDrawing" xmlns:w10="urn:schemas-microsoft-com:office:word" xmlns:w="http://schemas.openxmlformats.org/wordprocessingml/2006/main" xmlns:wne="http://schemas.microsoft.com/office/word/2006/wordml">
+<w:document xmlns:wpc="http://schemas.microsoft.com/office/word/2010/wordprocessingCanvas" xmlns:cx="http://schemas.microsoft.com/office/drawing/2014/chartex" xmlns:cx1="http://schemas.microsoft.com/office/drawing/2015/9/8/chartex" xmlns:cx2="http://schemas.microsoft.com/office/drawing/2015/10/21/chartex" xmlns:cx3="http://schemas.microsoft.com/office/drawing/2016/5/9/chartex" xmlns:cx4="http://schemas.microsoft.com/office/drawing/2016/5/10/chartex" xmlns:cx5="http://schemas.microsoft.com/office/drawing/2016/5/11/chartex" xmlns:cx6="http://schemas.microsoft.com/office/drawing/2016/5/12/chartex" xmlns:cx7="http://schemas.microsoft.com/office/drawing/2016/5/13/chartex" xmlns:cx8="http://schemas.microsoft.com/office/drawing/2016/5/14/chartex" xmlns:mc="http://schemas.openxmlformats.org/markup-compatibility/2006" xmlns:aink="http://schemas.microsoft.com/office/drawing/2016/ink" xmlns:am3d="http://schemas.microsoft.com/office/drawing/2017/model3d" xmlns:o="urn:schemas-microsoft-com:office:office" xmlns:oel="http://schemas.microsoft.com/office/2019/extlst" xmlns:r="http://schemas.openxmlformats.org/officeDocument/2006/relationships" xmlns:m="http://schemas.openxmlformats.org/officeDocument/2006/math" xmlns:v="urn:schemas-microsoft-com:vml" xmlns:wp14="http://schemas.microsoft.com/office/word/2010/wordprocessingDrawing" xmlns:wp="http://schemas.openxmlformats.org/drawingml/2006/wordprocessingDrawing" xmlns:w10="urn:schemas-microsoft-com:office:word" xmlns:w="http://schemas.openxmlformats.org/wordprocessingml/2006/main" xmlns:w14="http://schemas.microsoft.com/office/word/2010/wordml" xmlns:w15="http://schemas.microsoft.com/office/word/2012/wordml" xmlns:w16cex="http://schemas.microsoft.com/office/word/2018/wordml/cex" xmlns:w16cid="http://schemas.microsoft.com/office/word/2016/wordml/cid" xmlns:w16="http://schemas.microsoft.com/office/word/2018/wordml" xmlns:w16du="http://schemas.microsoft.com/office/word/2023/wordml/word16du" xmlns:w16sdtdh="http://schemas.microsoft.com/office/word/2020/wordml/sdtdatahash" xmlns:w16sdtfl="http://schemas.microsoft.com/office/word/2024/wordml/sdtformatlock" xmlns:w16se="http://schemas.microsoft.com/office/word/2015/wordml/symex" xmlns:wpg="http://schemas.microsoft.com/office/word/2010/wordprocessingGroup" xmlns:wpi="http://schemas.microsoft.com/office/word/2010/wordprocessingInk" xmlns:wne="http://schemas.microsoft.com/office/word/2006/wordml" xmlns:wps="http://schemas.microsoft.com/office/word/2010/wordprocessingShape" mc:Ignorable="w14 w15 w16se w16cid w16 w16cex w16sdtdh w16sdtfl w16du wp14">
   <w:body>
     <w:p>
       <w:pPr>
@@ -635,11 +635,7 @@
         <w:t xml:space="preserve"> </w:t>
       </w:r>
       <w:r>
-        <w:t xml:space="preserve">autonomous systems to exchange routes. </w:t>
-      </w:r>
-      <w:proofErr w:type="gramStart"/>
-      <w:r>
-        <w:t>Because BGP routers must regulate traffic between</w:t>
+        <w:t>autonomous systems to exchange routes. Because BGP routers must regulate traffic between</w:t>
       </w:r>
       <w:r>
         <w:rPr>
@@ -668,7 +664,6 @@
       <w:r>
         <w:t>with different policies.</w:t>
       </w:r>
-      <w:proofErr w:type="gramEnd"/>
     </w:p>
     <w:p>
       <w:pPr>
@@ -1546,21 +1541,22 @@
         <w:jc w:val="both"/>
       </w:pPr>
       <w:r>
-        <w:t>RIP is one of the oldest dynamic routing protocols on the Internet that is still in use.RIP is an</w:t>
-      </w:r>
-      <w:r>
-        <w:rPr>
-          <w:spacing w:val="1"/>
-        </w:rPr>
-        <w:t xml:space="preserve"> </w:t>
-      </w:r>
-      <w:proofErr w:type="spellStart"/>
-      <w:r>
-        <w:t>intradomain</w:t>
-      </w:r>
-      <w:proofErr w:type="spellEnd"/>
-      <w:r>
-        <w:t xml:space="preserve"> routing protocol that uses a distance vector approach to determine the paths</w:t>
+        <w:t>RIP is one of the oldest dynamic routing protocols on the Internet that is still in use.</w:t>
+      </w:r>
+      <w:r>
+        <w:t xml:space="preserve"> </w:t>
+      </w:r>
+      <w:r>
+        <w:t>RIP is an</w:t>
+      </w:r>
+      <w:r>
+        <w:rPr>
+          <w:spacing w:val="1"/>
+        </w:rPr>
+        <w:t xml:space="preserve"> </w:t>
+      </w:r>
+      <w:r>
+        <w:t>intradomain routing protocol that uses a distance vector approach to determine the paths</w:t>
       </w:r>
       <w:r>
         <w:rPr>
@@ -1839,11 +1835,9 @@
         </w:rPr>
         <w:t xml:space="preserve"> </w:t>
       </w:r>
-      <w:proofErr w:type="gramStart"/>
       <w:r>
         <w:t>Above</w:t>
       </w:r>
-      <w:proofErr w:type="gramEnd"/>
       <w:r>
         <w:rPr>
           <w:spacing w:val="-3"/>
@@ -1886,7 +1880,6 @@
         <w:pStyle w:val="Heading3"/>
         <w:jc w:val="both"/>
       </w:pPr>
-      <w:proofErr w:type="gramStart"/>
       <w:r>
         <w:t>Exercise</w:t>
       </w:r>
@@ -1899,7 +1892,6 @@
       <w:r>
         <w:t>1.</w:t>
       </w:r>
-      <w:proofErr w:type="gramEnd"/>
       <w:r>
         <w:rPr>
           <w:spacing w:val="-1"/>
@@ -2068,7 +2060,6 @@
               <v:imagedata r:id="rId9" o:title=""/>
             </v:shape>
             <v:rect id="_x0000_s1172" style="position:absolute;left:7;top:8437;width:9360;height:3570" filled="f"/>
-            <w10:wrap type="none"/>
             <w10:anchorlock/>
           </v:group>
         </w:pict>
@@ -2835,15 +2826,7 @@
         <w:t xml:space="preserve"> </w:t>
       </w:r>
       <w:r>
-        <w:t xml:space="preserve">metric of its network interfaces to all other routers in the network, </w:t>
-      </w:r>
-      <w:proofErr w:type="gramStart"/>
-      <w:r>
-        <w:t>The</w:t>
-      </w:r>
-      <w:proofErr w:type="gramEnd"/>
-      <w:r>
-        <w:t xml:space="preserve"> information about the</w:t>
+        <w:t>metric of its network interfaces to all other routers in the network, The information about the</w:t>
       </w:r>
       <w:r>
         <w:rPr>
@@ -2888,15 +2871,7 @@
         <w:t xml:space="preserve"> </w:t>
       </w:r>
       <w:r>
-        <w:t xml:space="preserve">router with complete information about the topology of the </w:t>
-      </w:r>
-      <w:proofErr w:type="gramStart"/>
-      <w:r>
-        <w:t>network,</w:t>
-      </w:r>
-      <w:proofErr w:type="gramEnd"/>
-      <w:r>
-        <w:t xml:space="preserve"> Routers use their link</w:t>
+        <w:t>router with complete information about the topology of the network, Routers use their link</w:t>
       </w:r>
       <w:r>
         <w:rPr>
@@ -3042,15 +3017,7 @@
         <w:jc w:val="both"/>
       </w:pPr>
       <w:r>
-        <w:t xml:space="preserve">The network configuration is shown in Figure 2 and Table 2. Note that PC1-4 </w:t>
-      </w:r>
-      <w:proofErr w:type="gramStart"/>
-      <w:r>
-        <w:t>are</w:t>
-      </w:r>
-      <w:proofErr w:type="gramEnd"/>
-      <w:r>
-        <w:t xml:space="preserve"> set up as</w:t>
+        <w:t>The network configuration is shown in Figure 2 and Table 2. Note that PC1-4 are set up as</w:t>
       </w:r>
       <w:r>
         <w:rPr>
@@ -3680,7 +3647,6 @@
               <v:imagedata r:id="rId13" o:title=""/>
             </v:shape>
             <v:rect id="_x0000_s1167" style="position:absolute;left:7;top:7;width:9375;height:4095" filled="f"/>
-            <w10:wrap type="none"/>
             <w10:anchorlock/>
           </v:group>
         </w:pict>
@@ -3750,7 +3716,6 @@
               <v:imagedata r:id="rId15" o:title=""/>
             </v:shape>
             <v:rect id="_x0000_s1164" style="position:absolute;left:7;top:7;width:9375;height:5475" filled="f"/>
-            <w10:wrap type="none"/>
             <w10:anchorlock/>
           </v:group>
         </w:pict>
@@ -4131,7 +4096,6 @@
               <v:imagedata r:id="rId17" o:title=""/>
             </v:shape>
             <v:rect id="_x0000_s1161" style="position:absolute;left:7;top:7;width:8250;height:3914" filled="f"/>
-            <w10:wrap type="none"/>
             <w10:anchorlock/>
           </v:group>
         </w:pict>
@@ -5176,12 +5140,10 @@
         <w:spacing w:before="90" w:line="276" w:lineRule="auto"/>
         <w:ind w:left="460" w:right="698"/>
       </w:pPr>
-      <w:proofErr w:type="gramStart"/>
       <w:r>
         <w:lastRenderedPageBreak/>
         <w:t>quickly</w:t>
       </w:r>
-      <w:proofErr w:type="gramEnd"/>
       <w:r>
         <w:rPr>
           <w:spacing w:val="11"/>
@@ -5384,21 +5346,7 @@
         <w:rPr>
           <w:sz w:val="24"/>
         </w:rPr>
-        <w:t xml:space="preserve">On PC1, start to capture traffic with </w:t>
-      </w:r>
-      <w:proofErr w:type="spellStart"/>
-      <w:r>
-        <w:rPr>
-          <w:sz w:val="24"/>
-        </w:rPr>
-        <w:t>Wireshark</w:t>
-      </w:r>
-      <w:proofErr w:type="spellEnd"/>
-      <w:r>
-        <w:rPr>
-          <w:sz w:val="24"/>
-        </w:rPr>
-        <w:t xml:space="preserve"> on interface FastEthernet0/0. Set a filter to</w:t>
+        <w:t>On PC1, start to capture traffic with Wireshark on interface FastEthernet0/0. Set a filter to</w:t>
       </w:r>
       <w:r>
         <w:rPr>
@@ -6118,21 +6066,7 @@
         <w:rPr>
           <w:sz w:val="24"/>
         </w:rPr>
-        <w:t xml:space="preserve">Now OSPF updates the routing tables. Use the </w:t>
-      </w:r>
-      <w:proofErr w:type="spellStart"/>
-      <w:r>
-        <w:rPr>
-          <w:sz w:val="24"/>
-        </w:rPr>
-        <w:t>Wireshark</w:t>
-      </w:r>
-      <w:proofErr w:type="spellEnd"/>
-      <w:r>
-        <w:rPr>
-          <w:sz w:val="24"/>
-        </w:rPr>
-        <w:t xml:space="preserve"> window on PC1 to observe the</w:t>
+        <w:t>Now OSPF updates the routing tables. Use the Wireshark window on PC1 to observe the</w:t>
       </w:r>
       <w:r>
         <w:rPr>
@@ -7190,21 +7124,7 @@
         <w:rPr>
           <w:sz w:val="24"/>
         </w:rPr>
-        <w:t xml:space="preserve">Issue another trace command from PC3 to IP address 10.0.7.7 </w:t>
-      </w:r>
-      <w:proofErr w:type="gramStart"/>
-      <w:r>
-        <w:rPr>
-          <w:sz w:val="24"/>
-        </w:rPr>
-        <w:t>By</w:t>
-      </w:r>
-      <w:proofErr w:type="gramEnd"/>
-      <w:r>
-        <w:rPr>
-          <w:sz w:val="24"/>
-        </w:rPr>
-        <w:t xml:space="preserve"> now, the output should</w:t>
+        <w:t>Issue another trace command from PC3 to IP address 10.0.7.7 By now, the output should</w:t>
       </w:r>
       <w:r>
         <w:rPr>
@@ -7514,14 +7434,12 @@
         </w:rPr>
         <w:t xml:space="preserve"> </w:t>
       </w:r>
-      <w:proofErr w:type="spellStart"/>
       <w:r>
         <w:rPr>
           <w:sz w:val="24"/>
         </w:rPr>
         <w:t>Wireshark</w:t>
       </w:r>
-      <w:proofErr w:type="spellEnd"/>
       <w:r>
         <w:rPr>
           <w:spacing w:val="54"/>
@@ -7698,36 +7616,18 @@
         <w:ind w:left="460" w:right="698"/>
         <w:jc w:val="both"/>
       </w:pPr>
-      <w:proofErr w:type="spellStart"/>
-      <w:proofErr w:type="gramStart"/>
       <w:r>
         <w:lastRenderedPageBreak/>
-        <w:t>Wireshark</w:t>
-      </w:r>
-      <w:proofErr w:type="spellEnd"/>
-      <w:r>
-        <w:t>.</w:t>
-      </w:r>
-      <w:proofErr w:type="gramEnd"/>
-      <w:r>
-        <w:t xml:space="preserve"> Save one copy of each type of OSPF packet that you observed. a) Pick a single</w:t>
-      </w:r>
-      <w:r>
-        <w:rPr>
-          <w:spacing w:val="1"/>
-        </w:rPr>
-        <w:t xml:space="preserve"> </w:t>
-      </w:r>
-      <w:r>
-        <w:t xml:space="preserve">link state advertisement packet captured by </w:t>
-      </w:r>
-      <w:proofErr w:type="spellStart"/>
-      <w:r>
-        <w:t>Wireshark</w:t>
-      </w:r>
-      <w:proofErr w:type="spellEnd"/>
-      <w:r>
-        <w:t>, and describe how to interpret the</w:t>
+        <w:t>Wireshark. Save one copy of each type of OSPF packet that you observed. a) Pick a single</w:t>
+      </w:r>
+      <w:r>
+        <w:rPr>
+          <w:spacing w:val="1"/>
+        </w:rPr>
+        <w:t xml:space="preserve"> </w:t>
+      </w:r>
+      <w:r>
+        <w:t>link state advertisement packet captured by Wireshark, and describe how to interpret the</w:t>
       </w:r>
       <w:r>
         <w:rPr>
@@ -8030,29 +7930,16 @@
         <w:t xml:space="preserve"> </w:t>
       </w:r>
       <w:r>
-        <w:t xml:space="preserve">this part is shown in Figure 3, and the IP configuration information is given in table 3. </w:t>
-      </w:r>
-      <w:proofErr w:type="gramStart"/>
-      <w:r>
-        <w:t>the</w:t>
-      </w:r>
-      <w:proofErr w:type="gramEnd"/>
-      <w:r>
-        <w:rPr>
-          <w:spacing w:val="1"/>
-        </w:rPr>
-        <w:t xml:space="preserve"> </w:t>
-      </w:r>
-      <w:r>
-        <w:t xml:space="preserve">network has three autonomous systems with AS numbers 100, 200 and 300. </w:t>
-      </w:r>
-      <w:proofErr w:type="gramStart"/>
-      <w:r>
-        <w:t>PC4,</w:t>
-      </w:r>
-      <w:proofErr w:type="gramEnd"/>
-      <w:r>
-        <w:t xml:space="preserve"> is used to</w:t>
+        <w:t>this part is shown in Figure 3, and the IP configuration information is given in table 3. the</w:t>
+      </w:r>
+      <w:r>
+        <w:rPr>
+          <w:spacing w:val="1"/>
+        </w:rPr>
+        <w:t xml:space="preserve"> </w:t>
+      </w:r>
+      <w:r>
+        <w:t>network has three autonomous systems with AS numbers 100, 200 and 300. PC4, is used to</w:t>
       </w:r>
       <w:r>
         <w:rPr>
@@ -8215,7 +8102,6 @@
               <v:imagedata r:id="rId20" o:title=""/>
             </v:shape>
             <v:rect id="_x0000_s1158" style="position:absolute;left:7;top:7;width:9360;height:2490" filled="f"/>
-            <w10:wrap type="none"/>
             <w10:anchorlock/>
           </v:group>
         </w:pict>
@@ -8354,7 +8240,6 @@
         <w:rPr>
           <w:rFonts w:ascii="Calibri"/>
         </w:rPr>
-        <w:lastRenderedPageBreak/>
         <w:t>Table 3</w:t>
       </w:r>
       <w:r>
@@ -8485,53 +8370,54 @@
         <w:rPr>
           <w:color w:val="000009"/>
         </w:rPr>
-        <w:t xml:space="preserve">systems. The configuration is completed when you can issue ping commands </w:t>
+        <w:t>systems. The configuration is completed when you can issue ping commands between any</w:t>
+      </w:r>
+      <w:r>
+        <w:rPr>
+          <w:color w:val="000009"/>
+          <w:spacing w:val="1"/>
+        </w:rPr>
+        <w:t xml:space="preserve"> </w:t>
+      </w:r>
+      <w:r>
+        <w:rPr>
+          <w:color w:val="000009"/>
+        </w:rPr>
+        <w:t>two</w:t>
+      </w:r>
+      <w:r>
+        <w:rPr>
+          <w:color w:val="000009"/>
+          <w:spacing w:val="-1"/>
+        </w:rPr>
+        <w:t xml:space="preserve"> </w:t>
+      </w:r>
+      <w:r>
+        <w:rPr>
+          <w:color w:val="000009"/>
+        </w:rPr>
+        <w:t>PCs</w:t>
+      </w:r>
+      <w:r>
+        <w:rPr>
+          <w:color w:val="000009"/>
+          <w:spacing w:val="-1"/>
+        </w:rPr>
+        <w:t xml:space="preserve"> </w:t>
       </w:r>
       <w:proofErr w:type="gramStart"/>
       <w:r>
         <w:rPr>
           <w:color w:val="000009"/>
         </w:rPr>
-        <w:t>between any</w:t>
-      </w:r>
-      <w:r>
-        <w:rPr>
-          <w:color w:val="000009"/>
-          <w:spacing w:val="1"/>
-        </w:rPr>
-        <w:t xml:space="preserve"> </w:t>
-      </w:r>
-      <w:r>
-        <w:rPr>
-          <w:color w:val="000009"/>
-        </w:rPr>
-        <w:t>two</w:t>
-      </w:r>
-      <w:r>
-        <w:rPr>
-          <w:color w:val="000009"/>
-          <w:spacing w:val="-1"/>
-        </w:rPr>
-        <w:t xml:space="preserve"> </w:t>
-      </w:r>
-      <w:r>
-        <w:rPr>
-          <w:color w:val="000009"/>
-        </w:rPr>
-        <w:t>PCs</w:t>
-      </w:r>
-      <w:r>
-        <w:rPr>
-          <w:color w:val="000009"/>
-          <w:spacing w:val="-1"/>
-        </w:rPr>
-        <w:t xml:space="preserve"> </w:t>
-      </w:r>
-      <w:r>
-        <w:rPr>
-          <w:color w:val="000009"/>
-        </w:rPr>
-        <w:t>Next we</w:t>
+        <w:t>Next</w:t>
+      </w:r>
+      <w:proofErr w:type="gramEnd"/>
+      <w:r>
+        <w:rPr>
+          <w:color w:val="000009"/>
+        </w:rPr>
+        <w:t xml:space="preserve"> we</w:t>
       </w:r>
       <w:r>
         <w:rPr>
@@ -8546,7 +8432,6 @@
         </w:rPr>
         <w:t>summarize</w:t>
       </w:r>
-      <w:proofErr w:type="gramEnd"/>
       <w:r>
         <w:rPr>
           <w:color w:val="000009"/>
@@ -8695,7 +8580,6 @@
               <v:imagedata r:id="rId22" o:title=""/>
             </v:shape>
             <v:rect id="_x0000_s1155" style="position:absolute;left:7;top:7;width:9360;height:6750" filled="f"/>
-            <w10:wrap type="none"/>
             <w10:anchorlock/>
           </v:group>
         </w:pict>
@@ -9240,23 +9124,23 @@
         <w:t xml:space="preserve"> </w:t>
       </w:r>
       <w:r>
-        <w:t>/etc/</w:t>
+        <w:t>/</w:t>
       </w:r>
       <w:proofErr w:type="spellStart"/>
       <w:r>
+        <w:t>etc</w:t>
+      </w:r>
+      <w:proofErr w:type="spellEnd"/>
+      <w:r>
+        <w:t>/</w:t>
+      </w:r>
+      <w:proofErr w:type="spellStart"/>
+      <w:r>
         <w:t>init.d</w:t>
       </w:r>
       <w:proofErr w:type="spellEnd"/>
       <w:r>
-        <w:t>/</w:t>
-      </w:r>
-      <w:proofErr w:type="spellStart"/>
-      <w:r>
-        <w:t>quagga</w:t>
-      </w:r>
-      <w:proofErr w:type="spellEnd"/>
-      <w:r>
-        <w:t xml:space="preserve"> stop</w:t>
+        <w:t>/quagga stop</w:t>
       </w:r>
     </w:p>
     <w:p>
@@ -9849,12 +9733,10 @@
         <w:t xml:space="preserve">PC2% route add default </w:t>
       </w:r>
       <w:proofErr w:type="spellStart"/>
-      <w:proofErr w:type="gramStart"/>
       <w:r>
         <w:t>gw</w:t>
       </w:r>
       <w:proofErr w:type="spellEnd"/>
-      <w:proofErr w:type="gramEnd"/>
       <w:r>
         <w:t xml:space="preserve"> 10.0.2.2/24</w:t>
       </w:r>
@@ -9945,14 +9827,12 @@
         </w:rPr>
         <w:t xml:space="preserve"> </w:t>
       </w:r>
-      <w:proofErr w:type="spellStart"/>
       <w:r>
         <w:rPr>
           <w:rFonts w:ascii="Calibri"/>
         </w:rPr>
         <w:t>Wireshark</w:t>
       </w:r>
-      <w:proofErr w:type="spellEnd"/>
       <w:r>
         <w:rPr>
           <w:rFonts w:ascii="Calibri"/>
@@ -10935,21 +10815,7 @@
         <w:rPr>
           <w:sz w:val="24"/>
         </w:rPr>
-        <w:t xml:space="preserve">Describe the different types of BGP messages that you observe in the </w:t>
-      </w:r>
-      <w:proofErr w:type="spellStart"/>
-      <w:r>
-        <w:rPr>
-          <w:sz w:val="24"/>
-        </w:rPr>
-        <w:t>Wireshark</w:t>
-      </w:r>
-      <w:proofErr w:type="spellEnd"/>
-      <w:r>
-        <w:rPr>
-          <w:sz w:val="24"/>
-        </w:rPr>
-        <w:t xml:space="preserve"> window on</w:t>
+        <w:t>Describe the different types of BGP messages that you observe in the Wireshark window on</w:t>
       </w:r>
       <w:r>
         <w:rPr>
@@ -11344,14 +11210,12 @@
         </w:rPr>
         <w:t xml:space="preserve"> </w:t>
       </w:r>
-      <w:proofErr w:type="spellStart"/>
       <w:r>
         <w:rPr>
           <w:sz w:val="24"/>
         </w:rPr>
         <w:t>Wireshark</w:t>
       </w:r>
-      <w:proofErr w:type="spellEnd"/>
       <w:r>
         <w:rPr>
           <w:spacing w:val="1"/>
@@ -11502,19 +11366,11 @@
         </w:rPr>
         <w:t xml:space="preserve"> </w:t>
       </w:r>
-      <w:proofErr w:type="spellStart"/>
-      <w:r>
-        <w:rPr>
-          <w:sz w:val="24"/>
-        </w:rPr>
-        <w:t>Wireshark</w:t>
-      </w:r>
-      <w:proofErr w:type="spellEnd"/>
-      <w:r>
-        <w:rPr>
-          <w:sz w:val="24"/>
-        </w:rPr>
-        <w:t>.</w:t>
+      <w:r>
+        <w:rPr>
+          <w:sz w:val="24"/>
+        </w:rPr>
+        <w:t>Wireshark.</w:t>
       </w:r>
     </w:p>
     <w:p>
@@ -12210,21 +12066,7 @@
         <w:rPr>
           <w:sz w:val="24"/>
         </w:rPr>
-        <w:t xml:space="preserve">On PC4, run </w:t>
-      </w:r>
-      <w:proofErr w:type="spellStart"/>
-      <w:r>
-        <w:rPr>
-          <w:sz w:val="24"/>
-        </w:rPr>
-        <w:t>Wireshark</w:t>
-      </w:r>
-      <w:proofErr w:type="spellEnd"/>
-      <w:r>
-        <w:rPr>
-          <w:sz w:val="24"/>
-        </w:rPr>
-        <w:t xml:space="preserve"> and set a display filter for BGP. Observe the flow of BGP packets</w:t>
+        <w:t>On PC4, run Wireshark and set a display filter for BGP. Observe the flow of BGP packets</w:t>
       </w:r>
       <w:r>
         <w:rPr>
@@ -12287,21 +12129,7 @@
         <w:rPr>
           <w:sz w:val="24"/>
         </w:rPr>
-        <w:t xml:space="preserve">On all routers, change the keep </w:t>
-      </w:r>
-      <w:proofErr w:type="gramStart"/>
-      <w:r>
-        <w:rPr>
-          <w:sz w:val="24"/>
-        </w:rPr>
-        <w:t>alive</w:t>
-      </w:r>
-      <w:proofErr w:type="gramEnd"/>
-      <w:r>
-        <w:rPr>
-          <w:sz w:val="24"/>
-        </w:rPr>
-        <w:t xml:space="preserve"> timer to 10 seconds and the hold time timer to 30</w:t>
+        <w:t>On all routers, change the keep alive timer to 10 seconds and the hold time timer to 30</w:t>
       </w:r>
       <w:r>
         <w:rPr>
@@ -12401,18 +12229,8 @@
         </w:rPr>
         <w:t xml:space="preserve"> </w:t>
       </w:r>
-      <w:proofErr w:type="gramStart"/>
-      <w:r>
-        <w:t>Router2(</w:t>
-      </w:r>
-      <w:proofErr w:type="spellStart"/>
-      <w:proofErr w:type="gramEnd"/>
-      <w:r>
-        <w:t>config</w:t>
-      </w:r>
-      <w:proofErr w:type="spellEnd"/>
-      <w:r>
-        <w:t>)#router</w:t>
+      <w:r>
+        <w:t>Router2(config)#router</w:t>
       </w:r>
       <w:r>
         <w:rPr>
@@ -12441,43 +12259,41 @@
         <w:spacing w:line="448" w:lineRule="auto"/>
         <w:ind w:left="1180" w:right="5008"/>
       </w:pPr>
+      <w:r>
+        <w:t>Router2(config-</w:t>
+      </w:r>
       <w:proofErr w:type="gramStart"/>
       <w:r>
-        <w:t>Router2(</w:t>
+        <w:t>router)#</w:t>
+      </w:r>
+      <w:proofErr w:type="gramEnd"/>
+      <w:r>
+        <w:t xml:space="preserve"> timers </w:t>
       </w:r>
       <w:proofErr w:type="spellStart"/>
+      <w:r>
+        <w:t>bgp</w:t>
+      </w:r>
+      <w:proofErr w:type="spellEnd"/>
+      <w:r>
+        <w:t xml:space="preserve"> 10 30</w:t>
+      </w:r>
+      <w:r>
+        <w:rPr>
+          <w:spacing w:val="-58"/>
+        </w:rPr>
+        <w:t xml:space="preserve"> </w:t>
+      </w:r>
+      <w:r>
+        <w:t>Router2(config-</w:t>
+      </w:r>
+      <w:proofErr w:type="gramStart"/>
+      <w:r>
+        <w:t>router)#</w:t>
+      </w:r>
       <w:proofErr w:type="gramEnd"/>
       <w:r>
-        <w:t>config</w:t>
-      </w:r>
-      <w:proofErr w:type="spellEnd"/>
-      <w:r>
-        <w:t xml:space="preserve">-router)# timers </w:t>
-      </w:r>
-      <w:proofErr w:type="spellStart"/>
-      <w:r>
-        <w:t>bgp</w:t>
-      </w:r>
-      <w:proofErr w:type="spellEnd"/>
-      <w:r>
-        <w:t xml:space="preserve"> 10 30</w:t>
-      </w:r>
-      <w:r>
-        <w:rPr>
-          <w:spacing w:val="-58"/>
-        </w:rPr>
-        <w:t xml:space="preserve"> </w:t>
-      </w:r>
-      <w:r>
-        <w:t>Router2(</w:t>
-      </w:r>
-      <w:proofErr w:type="spellStart"/>
-      <w:r>
-        <w:t>config</w:t>
-      </w:r>
-      <w:proofErr w:type="spellEnd"/>
-      <w:r>
-        <w:t>-router)#end</w:t>
+        <w:t>end</w:t>
       </w:r>
       <w:r>
         <w:rPr>
@@ -13652,14 +13468,12 @@
         </w:rPr>
         <w:t xml:space="preserve"> </w:t>
       </w:r>
-      <w:proofErr w:type="spellStart"/>
       <w:r>
         <w:rPr>
           <w:sz w:val="24"/>
         </w:rPr>
         <w:t>Wireshark</w:t>
       </w:r>
-      <w:proofErr w:type="spellEnd"/>
       <w:r>
         <w:rPr>
           <w:spacing w:val="-1"/>
@@ -13745,14 +13559,12 @@
         </w:rPr>
         <w:t xml:space="preserve"> </w:t>
       </w:r>
-      <w:proofErr w:type="spellStart"/>
       <w:r>
         <w:rPr>
           <w:sz w:val="24"/>
         </w:rPr>
         <w:t>Wireshark</w:t>
       </w:r>
-      <w:proofErr w:type="spellEnd"/>
       <w:r>
         <w:rPr>
           <w:spacing w:val="-1"/>
@@ -14486,8 +14298,8 @@
 </file>
 
 <file path=word/numbering.xml><?xml version="1.0" encoding="utf-8"?>
-<w:numbering xmlns:ve="http://schemas.openxmlformats.org/markup-compatibility/2006" xmlns:o="urn:schemas-microsoft-com:office:office" xmlns:r="http://schemas.openxmlformats.org/officeDocument/2006/relationships" xmlns:m="http://schemas.openxmlformats.org/officeDocument/2006/math" xmlns:v="urn:schemas-microsoft-com:vml" xmlns:wp="http://schemas.openxmlformats.org/drawingml/2006/wordprocessingDrawing" xmlns:w10="urn:schemas-microsoft-com:office:word" xmlns:w="http://schemas.openxmlformats.org/wordprocessingml/2006/main" xmlns:wne="http://schemas.microsoft.com/office/word/2006/wordml">
-  <w:abstractNum w:abstractNumId="0">
+<w:numbering xmlns:wpc="http://schemas.microsoft.com/office/word/2010/wordprocessingCanvas" xmlns:cx="http://schemas.microsoft.com/office/drawing/2014/chartex" xmlns:cx1="http://schemas.microsoft.com/office/drawing/2015/9/8/chartex" xmlns:cx2="http://schemas.microsoft.com/office/drawing/2015/10/21/chartex" xmlns:cx3="http://schemas.microsoft.com/office/drawing/2016/5/9/chartex" xmlns:cx4="http://schemas.microsoft.com/office/drawing/2016/5/10/chartex" xmlns:cx5="http://schemas.microsoft.com/office/drawing/2016/5/11/chartex" xmlns:cx6="http://schemas.microsoft.com/office/drawing/2016/5/12/chartex" xmlns:cx7="http://schemas.microsoft.com/office/drawing/2016/5/13/chartex" xmlns:cx8="http://schemas.microsoft.com/office/drawing/2016/5/14/chartex" xmlns:mc="http://schemas.openxmlformats.org/markup-compatibility/2006" xmlns:aink="http://schemas.microsoft.com/office/drawing/2016/ink" xmlns:am3d="http://schemas.microsoft.com/office/drawing/2017/model3d" xmlns:o="urn:schemas-microsoft-com:office:office" xmlns:oel="http://schemas.microsoft.com/office/2019/extlst" xmlns:r="http://schemas.openxmlformats.org/officeDocument/2006/relationships" xmlns:m="http://schemas.openxmlformats.org/officeDocument/2006/math" xmlns:v="urn:schemas-microsoft-com:vml" xmlns:wp14="http://schemas.microsoft.com/office/word/2010/wordprocessingDrawing" xmlns:wp="http://schemas.openxmlformats.org/drawingml/2006/wordprocessingDrawing" xmlns:w10="urn:schemas-microsoft-com:office:word" xmlns:w="http://schemas.openxmlformats.org/wordprocessingml/2006/main" xmlns:w14="http://schemas.microsoft.com/office/word/2010/wordml" xmlns:w15="http://schemas.microsoft.com/office/word/2012/wordml" xmlns:w16cex="http://schemas.microsoft.com/office/word/2018/wordml/cex" xmlns:w16cid="http://schemas.microsoft.com/office/word/2016/wordml/cid" xmlns:w16="http://schemas.microsoft.com/office/word/2018/wordml" xmlns:w16du="http://schemas.microsoft.com/office/word/2023/wordml/word16du" xmlns:w16sdtdh="http://schemas.microsoft.com/office/word/2020/wordml/sdtdatahash" xmlns:w16sdtfl="http://schemas.microsoft.com/office/word/2024/wordml/sdtformatlock" xmlns:w16se="http://schemas.microsoft.com/office/word/2015/wordml/symex" xmlns:wpg="http://schemas.microsoft.com/office/word/2010/wordprocessingGroup" xmlns:wpi="http://schemas.microsoft.com/office/word/2010/wordprocessingInk" xmlns:wne="http://schemas.microsoft.com/office/word/2006/wordml" xmlns:wps="http://schemas.microsoft.com/office/word/2010/wordprocessingShape" mc:Ignorable="w14 w15 w16se w16cid w16 w16cex w16sdtdh w16sdtfl w16du wp14">
+  <w:abstractNum w:abstractNumId="0" w15:restartNumberingAfterBreak="0">
     <w:nsid w:val="028017DB"/>
     <w:multiLevelType w:val="hybridMultilevel"/>
     <w:tmpl w:val="BD4A70F0"/>
@@ -14602,7 +14414,7 @@
       </w:rPr>
     </w:lvl>
   </w:abstractNum>
-  <w:abstractNum w:abstractNumId="1">
+  <w:abstractNum w:abstractNumId="1" w15:restartNumberingAfterBreak="0">
     <w:nsid w:val="05071341"/>
     <w:multiLevelType w:val="hybridMultilevel"/>
     <w:tmpl w:val="B5448FDC"/>
@@ -14718,7 +14530,7 @@
       </w:rPr>
     </w:lvl>
   </w:abstractNum>
-  <w:abstractNum w:abstractNumId="2">
+  <w:abstractNum w:abstractNumId="2" w15:restartNumberingAfterBreak="0">
     <w:nsid w:val="1A6010CB"/>
     <w:multiLevelType w:val="hybridMultilevel"/>
     <w:tmpl w:val="D4B6E67E"/>
@@ -14835,7 +14647,7 @@
       </w:rPr>
     </w:lvl>
   </w:abstractNum>
-  <w:abstractNum w:abstractNumId="3">
+  <w:abstractNum w:abstractNumId="3" w15:restartNumberingAfterBreak="0">
     <w:nsid w:val="31084875"/>
     <w:multiLevelType w:val="hybridMultilevel"/>
     <w:tmpl w:val="FE4EAADA"/>
@@ -14951,7 +14763,7 @@
       </w:rPr>
     </w:lvl>
   </w:abstractNum>
-  <w:abstractNum w:abstractNumId="4">
+  <w:abstractNum w:abstractNumId="4" w15:restartNumberingAfterBreak="0">
     <w:nsid w:val="3C19593F"/>
     <w:multiLevelType w:val="hybridMultilevel"/>
     <w:tmpl w:val="06761684"/>
@@ -15068,7 +14880,7 @@
       </w:rPr>
     </w:lvl>
   </w:abstractNum>
-  <w:abstractNum w:abstractNumId="5">
+  <w:abstractNum w:abstractNumId="5" w15:restartNumberingAfterBreak="0">
     <w:nsid w:val="41633409"/>
     <w:multiLevelType w:val="hybridMultilevel"/>
     <w:tmpl w:val="F45E7E50"/>
@@ -15185,7 +14997,7 @@
       </w:rPr>
     </w:lvl>
   </w:abstractNum>
-  <w:abstractNum w:abstractNumId="6">
+  <w:abstractNum w:abstractNumId="6" w15:restartNumberingAfterBreak="0">
     <w:nsid w:val="47AF4044"/>
     <w:multiLevelType w:val="hybridMultilevel"/>
     <w:tmpl w:val="7D98AB52"/>
@@ -15305,7 +15117,7 @@
       </w:rPr>
     </w:lvl>
   </w:abstractNum>
-  <w:abstractNum w:abstractNumId="7">
+  <w:abstractNum w:abstractNumId="7" w15:restartNumberingAfterBreak="0">
     <w:nsid w:val="4CE83530"/>
     <w:multiLevelType w:val="hybridMultilevel"/>
     <w:tmpl w:val="817CE89A"/>
@@ -15426,7 +15238,7 @@
       </w:rPr>
     </w:lvl>
   </w:abstractNum>
-  <w:abstractNum w:abstractNumId="8">
+  <w:abstractNum w:abstractNumId="8" w15:restartNumberingAfterBreak="0">
     <w:nsid w:val="5DB22EC5"/>
     <w:multiLevelType w:val="hybridMultilevel"/>
     <w:tmpl w:val="E3967106"/>
@@ -15544,7 +15356,7 @@
       </w:rPr>
     </w:lvl>
   </w:abstractNum>
-  <w:abstractNum w:abstractNumId="9">
+  <w:abstractNum w:abstractNumId="9" w15:restartNumberingAfterBreak="0">
     <w:nsid w:val="76D521DE"/>
     <w:multiLevelType w:val="hybridMultilevel"/>
     <w:tmpl w:val="E7CAF590"/>
@@ -15661,34 +15473,34 @@
       </w:rPr>
     </w:lvl>
   </w:abstractNum>
-  <w:num w:numId="1">
+  <w:num w:numId="1" w16cid:durableId="388236868">
     <w:abstractNumId w:val="8"/>
   </w:num>
-  <w:num w:numId="2">
+  <w:num w:numId="2" w16cid:durableId="2124225902">
     <w:abstractNumId w:val="2"/>
   </w:num>
-  <w:num w:numId="3">
+  <w:num w:numId="3" w16cid:durableId="1008024662">
     <w:abstractNumId w:val="6"/>
   </w:num>
-  <w:num w:numId="4">
+  <w:num w:numId="4" w16cid:durableId="1354958553">
     <w:abstractNumId w:val="1"/>
   </w:num>
-  <w:num w:numId="5">
+  <w:num w:numId="5" w16cid:durableId="2126344860">
     <w:abstractNumId w:val="4"/>
   </w:num>
-  <w:num w:numId="6">
+  <w:num w:numId="6" w16cid:durableId="1573929115">
     <w:abstractNumId w:val="0"/>
   </w:num>
-  <w:num w:numId="7">
+  <w:num w:numId="7" w16cid:durableId="2001929865">
     <w:abstractNumId w:val="9"/>
   </w:num>
-  <w:num w:numId="8">
+  <w:num w:numId="8" w16cid:durableId="1851796040">
     <w:abstractNumId w:val="3"/>
   </w:num>
-  <w:num w:numId="9">
+  <w:num w:numId="9" w16cid:durableId="1174109535">
     <w:abstractNumId w:val="5"/>
   </w:num>
-  <w:num w:numId="10">
+  <w:num w:numId="10" w16cid:durableId="2135370181">
     <w:abstractNumId w:val="7"/>
   </w:num>
   <w:numIdMacAtCleanup w:val="10"/>
@@ -15696,7 +15508,7 @@
 </file>
 
 <file path=word/styles.xml><?xml version="1.0" encoding="utf-8"?>
-<w:styles xmlns:r="http://schemas.openxmlformats.org/officeDocument/2006/relationships" xmlns:w="http://schemas.openxmlformats.org/wordprocessingml/2006/main">
+<w:styles xmlns:mc="http://schemas.openxmlformats.org/markup-compatibility/2006" xmlns:r="http://schemas.openxmlformats.org/officeDocument/2006/relationships" xmlns:w="http://schemas.openxmlformats.org/wordprocessingml/2006/main" xmlns:w14="http://schemas.microsoft.com/office/word/2010/wordml" xmlns:w15="http://schemas.microsoft.com/office/word/2012/wordml" xmlns:w16cex="http://schemas.microsoft.com/office/word/2018/wordml/cex" xmlns:w16cid="http://schemas.microsoft.com/office/word/2016/wordml/cid" xmlns:w16="http://schemas.microsoft.com/office/word/2018/wordml" xmlns:w16du="http://schemas.microsoft.com/office/word/2023/wordml/word16du" xmlns:w16sdtdh="http://schemas.microsoft.com/office/word/2020/wordml/sdtdatahash" xmlns:w16sdtfl="http://schemas.microsoft.com/office/word/2024/wordml/sdtformatlock" xmlns:w16se="http://schemas.microsoft.com/office/word/2015/wordml/symex" mc:Ignorable="w14 w15 w16se w16cid w16 w16cex w16sdtdh w16sdtfl w16du">
   <w:docDefaults>
     <w:rPrDefault>
       <w:rPr>
@@ -15712,145 +15524,383 @@
       </w:pPr>
     </w:pPrDefault>
   </w:docDefaults>
-  <w:latentStyles w:defLockedState="0" w:defUIPriority="99" w:defSemiHidden="1" w:defUnhideWhenUsed="1" w:defQFormat="0" w:count="267">
-    <w:lsdException w:name="Normal" w:semiHidden="0" w:uiPriority="1" w:unhideWhenUsed="0" w:qFormat="1"/>
-    <w:lsdException w:name="heading 1" w:semiHidden="0" w:uiPriority="1" w:unhideWhenUsed="0" w:qFormat="1"/>
-    <w:lsdException w:name="heading 2" w:uiPriority="1" w:qFormat="1"/>
-    <w:lsdException w:name="heading 3" w:uiPriority="1" w:qFormat="1"/>
-    <w:lsdException w:name="heading 4" w:uiPriority="9" w:qFormat="1"/>
-    <w:lsdException w:name="heading 5" w:uiPriority="9" w:qFormat="1"/>
-    <w:lsdException w:name="heading 6" w:uiPriority="9" w:qFormat="1"/>
-    <w:lsdException w:name="heading 7" w:uiPriority="9" w:qFormat="1"/>
-    <w:lsdException w:name="heading 8" w:uiPriority="9" w:qFormat="1"/>
-    <w:lsdException w:name="heading 9" w:uiPriority="9" w:qFormat="1"/>
-    <w:lsdException w:name="toc 1" w:uiPriority="39"/>
-    <w:lsdException w:name="toc 2" w:uiPriority="39"/>
-    <w:lsdException w:name="toc 3" w:uiPriority="39"/>
-    <w:lsdException w:name="toc 4" w:uiPriority="39"/>
-    <w:lsdException w:name="toc 5" w:uiPriority="39"/>
-    <w:lsdException w:name="toc 6" w:uiPriority="39"/>
-    <w:lsdException w:name="toc 7" w:uiPriority="39"/>
-    <w:lsdException w:name="toc 8" w:uiPriority="39"/>
-    <w:lsdException w:name="toc 9" w:uiPriority="39"/>
-    <w:lsdException w:name="caption" w:uiPriority="35" w:qFormat="1"/>
-    <w:lsdException w:name="Title" w:semiHidden="0" w:uiPriority="1" w:unhideWhenUsed="0" w:qFormat="1"/>
-    <w:lsdException w:name="Default Paragraph Font" w:uiPriority="1"/>
-    <w:lsdException w:name="Body Text" w:uiPriority="1" w:qFormat="1"/>
-    <w:lsdException w:name="Subtitle" w:semiHidden="0" w:uiPriority="11" w:unhideWhenUsed="0" w:qFormat="1"/>
-    <w:lsdException w:name="Strong" w:semiHidden="0" w:uiPriority="22" w:unhideWhenUsed="0" w:qFormat="1"/>
-    <w:lsdException w:name="Emphasis" w:semiHidden="0" w:uiPriority="20" w:unhideWhenUsed="0" w:qFormat="1"/>
-    <w:lsdException w:name="Table Grid" w:semiHidden="0" w:uiPriority="59" w:unhideWhenUsed="0"/>
-    <w:lsdException w:name="Placeholder Text" w:unhideWhenUsed="0"/>
-    <w:lsdException w:name="No Spacing" w:semiHidden="0" w:uiPriority="1" w:unhideWhenUsed="0" w:qFormat="1"/>
-    <w:lsdException w:name="Light Shading" w:semiHidden="0" w:uiPriority="60" w:unhideWhenUsed="0"/>
-    <w:lsdException w:name="Light List" w:semiHidden="0" w:uiPriority="61" w:unhideWhenUsed="0"/>
-    <w:lsdException w:name="Light Grid" w:semiHidden="0" w:uiPriority="62" w:unhideWhenUsed="0"/>
-    <w:lsdException w:name="Medium Shading 1" w:semiHidden="0" w:uiPriority="63" w:unhideWhenUsed="0"/>
-    <w:lsdException w:name="Medium Shading 2" w:semiHidden="0" w:uiPriority="64" w:unhideWhenUsed="0"/>
-    <w:lsdException w:name="Medium List 1" w:semiHidden="0" w:uiPriority="65" w:unhideWhenUsed="0"/>
-    <w:lsdException w:name="Medium List 2" w:semiHidden="0" w:uiPriority="66" w:unhideWhenUsed="0"/>
-    <w:lsdException w:name="Medium Grid 1" w:semiHidden="0" w:uiPriority="67" w:unhideWhenUsed="0"/>
-    <w:lsdException w:name="Medium Grid 2" w:semiHidden="0" w:uiPriority="68" w:unhideWhenUsed="0"/>
-    <w:lsdException w:name="Medium Grid 3" w:semiHidden="0" w:uiPriority="69" w:unhideWhenUsed="0"/>
-    <w:lsdException w:name="Dark List" w:semiHidden="0" w:uiPriority="70" w:unhideWhenUsed="0"/>
-    <w:lsdException w:name="Colorful Shading" w:semiHidden="0" w:uiPriority="71" w:unhideWhenUsed="0"/>
-    <w:lsdException w:name="Colorful List" w:semiHidden="0" w:uiPriority="72" w:unhideWhenUsed="0"/>
-    <w:lsdException w:name="Colorful Grid" w:semiHidden="0" w:uiPriority="73" w:unhideWhenUsed="0"/>
-    <w:lsdException w:name="Light Shading Accent 1" w:semiHidden="0" w:uiPriority="60" w:unhideWhenUsed="0"/>
-    <w:lsdException w:name="Light List Accent 1" w:semiHidden="0" w:uiPriority="61" w:unhideWhenUsed="0"/>
-    <w:lsdException w:name="Light Grid Accent 1" w:semiHidden="0" w:uiPriority="62" w:unhideWhenUsed="0"/>
-    <w:lsdException w:name="Medium Shading 1 Accent 1" w:semiHidden="0" w:uiPriority="63" w:unhideWhenUsed="0"/>
-    <w:lsdException w:name="Medium Shading 2 Accent 1" w:semiHidden="0" w:uiPriority="64" w:unhideWhenUsed="0"/>
-    <w:lsdException w:name="Medium List 1 Accent 1" w:semiHidden="0" w:uiPriority="65" w:unhideWhenUsed="0"/>
-    <w:lsdException w:name="Revision" w:unhideWhenUsed="0"/>
-    <w:lsdException w:name="List Paragraph" w:semiHidden="0" w:uiPriority="1" w:unhideWhenUsed="0" w:qFormat="1"/>
-    <w:lsdException w:name="Quote" w:semiHidden="0" w:uiPriority="29" w:unhideWhenUsed="0" w:qFormat="1"/>
-    <w:lsdException w:name="Intense Quote" w:semiHidden="0" w:uiPriority="30" w:unhideWhenUsed="0" w:qFormat="1"/>
-    <w:lsdException w:name="Medium List 2 Accent 1" w:semiHidden="0" w:uiPriority="66" w:unhideWhenUsed="0"/>
-    <w:lsdException w:name="Medium Grid 1 Accent 1" w:semiHidden="0" w:uiPriority="67" w:unhideWhenUsed="0"/>
-    <w:lsdException w:name="Medium Grid 2 Accent 1" w:semiHidden="0" w:uiPriority="68" w:unhideWhenUsed="0"/>
-    <w:lsdException w:name="Medium Grid 3 Accent 1" w:semiHidden="0" w:uiPriority="69" w:unhideWhenUsed="0"/>
-    <w:lsdException w:name="Dark List Accent 1" w:semiHidden="0" w:uiPriority="70" w:unhideWhenUsed="0"/>
-    <w:lsdException w:name="Colorful Shading Accent 1" w:semiHidden="0" w:uiPriority="71" w:unhideWhenUsed="0"/>
-    <w:lsdException w:name="Colorful List Accent 1" w:semiHidden="0" w:uiPriority="72" w:unhideWhenUsed="0"/>
-    <w:lsdException w:name="Colorful Grid Accent 1" w:semiHidden="0" w:uiPriority="73" w:unhideWhenUsed="0"/>
-    <w:lsdException w:name="Light Shading Accent 2" w:semiHidden="0" w:uiPriority="60" w:unhideWhenUsed="0"/>
-    <w:lsdException w:name="Light List Accent 2" w:semiHidden="0" w:uiPriority="61" w:unhideWhenUsed="0"/>
-    <w:lsdException w:name="Light Grid Accent 2" w:semiHidden="0" w:uiPriority="62" w:unhideWhenUsed="0"/>
-    <w:lsdException w:name="Medium Shading 1 Accent 2" w:semiHidden="0" w:uiPriority="63" w:unhideWhenUsed="0"/>
-    <w:lsdException w:name="Medium Shading 2 Accent 2" w:semiHidden="0" w:uiPriority="64" w:unhideWhenUsed="0"/>
-    <w:lsdException w:name="Medium List 1 Accent 2" w:semiHidden="0" w:uiPriority="65" w:unhideWhenUsed="0"/>
-    <w:lsdException w:name="Medium List 2 Accent 2" w:semiHidden="0" w:uiPriority="66" w:unhideWhenUsed="0"/>
-    <w:lsdException w:name="Medium Grid 1 Accent 2" w:semiHidden="0" w:uiPriority="67" w:unhideWhenUsed="0"/>
-    <w:lsdException w:name="Medium Grid 2 Accent 2" w:semiHidden="0" w:uiPriority="68" w:unhideWhenUsed="0"/>
-    <w:lsdException w:name="Medium Grid 3 Accent 2" w:semiHidden="0" w:uiPriority="69" w:unhideWhenUsed="0"/>
-    <w:lsdException w:name="Dark List Accent 2" w:semiHidden="0" w:uiPriority="70" w:unhideWhenUsed="0"/>
-    <w:lsdException w:name="Colorful Shading Accent 2" w:semiHidden="0" w:uiPriority="71" w:unhideWhenUsed="0"/>
-    <w:lsdException w:name="Colorful List Accent 2" w:semiHidden="0" w:uiPriority="72" w:unhideWhenUsed="0"/>
-    <w:lsdException w:name="Colorful Grid Accent 2" w:semiHidden="0" w:uiPriority="73" w:unhideWhenUsed="0"/>
-    <w:lsdException w:name="Light Shading Accent 3" w:semiHidden="0" w:uiPriority="60" w:unhideWhenUsed="0"/>
-    <w:lsdException w:name="Light List Accent 3" w:semiHidden="0" w:uiPriority="61" w:unhideWhenUsed="0"/>
-    <w:lsdException w:name="Light Grid Accent 3" w:semiHidden="0" w:uiPriority="62" w:unhideWhenUsed="0"/>
-    <w:lsdException w:name="Medium Shading 1 Accent 3" w:semiHidden="0" w:uiPriority="63" w:unhideWhenUsed="0"/>
-    <w:lsdException w:name="Medium Shading 2 Accent 3" w:semiHidden="0" w:uiPriority="64" w:unhideWhenUsed="0"/>
-    <w:lsdException w:name="Medium List 1 Accent 3" w:semiHidden="0" w:uiPriority="65" w:unhideWhenUsed="0"/>
-    <w:lsdException w:name="Medium List 2 Accent 3" w:semiHidden="0" w:uiPriority="66" w:unhideWhenUsed="0"/>
-    <w:lsdException w:name="Medium Grid 1 Accent 3" w:semiHidden="0" w:uiPriority="67" w:unhideWhenUsed="0"/>
-    <w:lsdException w:name="Medium Grid 2 Accent 3" w:semiHidden="0" w:uiPriority="68" w:unhideWhenUsed="0"/>
-    <w:lsdException w:name="Medium Grid 3 Accent 3" w:semiHidden="0" w:uiPriority="69" w:unhideWhenUsed="0"/>
-    <w:lsdException w:name="Dark List Accent 3" w:semiHidden="0" w:uiPriority="70" w:unhideWhenUsed="0"/>
-    <w:lsdException w:name="Colorful Shading Accent 3" w:semiHidden="0" w:uiPriority="71" w:unhideWhenUsed="0"/>
-    <w:lsdException w:name="Colorful List Accent 3" w:semiHidden="0" w:uiPriority="72" w:unhideWhenUsed="0"/>
-    <w:lsdException w:name="Colorful Grid Accent 3" w:semiHidden="0" w:uiPriority="73" w:unhideWhenUsed="0"/>
-    <w:lsdException w:name="Light Shading Accent 4" w:semiHidden="0" w:uiPriority="60" w:unhideWhenUsed="0"/>
-    <w:lsdException w:name="Light List Accent 4" w:semiHidden="0" w:uiPriority="61" w:unhideWhenUsed="0"/>
-    <w:lsdException w:name="Light Grid Accent 4" w:semiHidden="0" w:uiPriority="62" w:unhideWhenUsed="0"/>
-    <w:lsdException w:name="Medium Shading 1 Accent 4" w:semiHidden="0" w:uiPriority="63" w:unhideWhenUsed="0"/>
-    <w:lsdException w:name="Medium Shading 2 Accent 4" w:semiHidden="0" w:uiPriority="64" w:unhideWhenUsed="0"/>
-    <w:lsdException w:name="Medium List 1 Accent 4" w:semiHidden="0" w:uiPriority="65" w:unhideWhenUsed="0"/>
-    <w:lsdException w:name="Medium List 2 Accent 4" w:semiHidden="0" w:uiPriority="66" w:unhideWhenUsed="0"/>
-    <w:lsdException w:name="Medium Grid 1 Accent 4" w:semiHidden="0" w:uiPriority="67" w:unhideWhenUsed="0"/>
-    <w:lsdException w:name="Medium Grid 2 Accent 4" w:semiHidden="0" w:uiPriority="68" w:unhideWhenUsed="0"/>
-    <w:lsdException w:name="Medium Grid 3 Accent 4" w:semiHidden="0" w:uiPriority="69" w:unhideWhenUsed="0"/>
-    <w:lsdException w:name="Dark List Accent 4" w:semiHidden="0" w:uiPriority="70" w:unhideWhenUsed="0"/>
-    <w:lsdException w:name="Colorful Shading Accent 4" w:semiHidden="0" w:uiPriority="71" w:unhideWhenUsed="0"/>
-    <w:lsdException w:name="Colorful List Accent 4" w:semiHidden="0" w:uiPriority="72" w:unhideWhenUsed="0"/>
-    <w:lsdException w:name="Colorful Grid Accent 4" w:semiHidden="0" w:uiPriority="73" w:unhideWhenUsed="0"/>
-    <w:lsdException w:name="Light Shading Accent 5" w:semiHidden="0" w:uiPriority="60" w:unhideWhenUsed="0"/>
-    <w:lsdException w:name="Light List Accent 5" w:semiHidden="0" w:uiPriority="61" w:unhideWhenUsed="0"/>
-    <w:lsdException w:name="Light Grid Accent 5" w:semiHidden="0" w:uiPriority="62" w:unhideWhenUsed="0"/>
-    <w:lsdException w:name="Medium Shading 1 Accent 5" w:semiHidden="0" w:uiPriority="63" w:unhideWhenUsed="0"/>
-    <w:lsdException w:name="Medium Shading 2 Accent 5" w:semiHidden="0" w:uiPriority="64" w:unhideWhenUsed="0"/>
-    <w:lsdException w:name="Medium List 1 Accent 5" w:semiHidden="0" w:uiPriority="65" w:unhideWhenUsed="0"/>
-    <w:lsdException w:name="Medium List 2 Accent 5" w:semiHidden="0" w:uiPriority="66" w:unhideWhenUsed="0"/>
-    <w:lsdException w:name="Medium Grid 1 Accent 5" w:semiHidden="0" w:uiPriority="67" w:unhideWhenUsed="0"/>
-    <w:lsdException w:name="Medium Grid 2 Accent 5" w:semiHidden="0" w:uiPriority="68" w:unhideWhenUsed="0"/>
-    <w:lsdException w:name="Medium Grid 3 Accent 5" w:semiHidden="0" w:uiPriority="69" w:unhideWhenUsed="0"/>
-    <w:lsdException w:name="Dark List Accent 5" w:semiHidden="0" w:uiPriority="70" w:unhideWhenUsed="0"/>
-    <w:lsdException w:name="Colorful Shading Accent 5" w:semiHidden="0" w:uiPriority="71" w:unhideWhenUsed="0"/>
-    <w:lsdException w:name="Colorful List Accent 5" w:semiHidden="0" w:uiPriority="72" w:unhideWhenUsed="0"/>
-    <w:lsdException w:name="Colorful Grid Accent 5" w:semiHidden="0" w:uiPriority="73" w:unhideWhenUsed="0"/>
-    <w:lsdException w:name="Light Shading Accent 6" w:semiHidden="0" w:uiPriority="60" w:unhideWhenUsed="0"/>
-    <w:lsdException w:name="Light List Accent 6" w:semiHidden="0" w:uiPriority="61" w:unhideWhenUsed="0"/>
-    <w:lsdException w:name="Light Grid Accent 6" w:semiHidden="0" w:uiPriority="62" w:unhideWhenUsed="0"/>
-    <w:lsdException w:name="Medium Shading 1 Accent 6" w:semiHidden="0" w:uiPriority="63" w:unhideWhenUsed="0"/>
-    <w:lsdException w:name="Medium Shading 2 Accent 6" w:semiHidden="0" w:uiPriority="64" w:unhideWhenUsed="0"/>
-    <w:lsdException w:name="Medium List 1 Accent 6" w:semiHidden="0" w:uiPriority="65" w:unhideWhenUsed="0"/>
-    <w:lsdException w:name="Medium List 2 Accent 6" w:semiHidden="0" w:uiPriority="66" w:unhideWhenUsed="0"/>
-    <w:lsdException w:name="Medium Grid 1 Accent 6" w:semiHidden="0" w:uiPriority="67" w:unhideWhenUsed="0"/>
-    <w:lsdException w:name="Medium Grid 2 Accent 6" w:semiHidden="0" w:uiPriority="68" w:unhideWhenUsed="0"/>
-    <w:lsdException w:name="Medium Grid 3 Accent 6" w:semiHidden="0" w:uiPriority="69" w:unhideWhenUsed="0"/>
-    <w:lsdException w:name="Dark List Accent 6" w:semiHidden="0" w:uiPriority="70" w:unhideWhenUsed="0"/>
-    <w:lsdException w:name="Colorful Shading Accent 6" w:semiHidden="0" w:uiPriority="71" w:unhideWhenUsed="0"/>
-    <w:lsdException w:name="Colorful List Accent 6" w:semiHidden="0" w:uiPriority="72" w:unhideWhenUsed="0"/>
-    <w:lsdException w:name="Colorful Grid Accent 6" w:semiHidden="0" w:uiPriority="73" w:unhideWhenUsed="0"/>
-    <w:lsdException w:name="Subtle Emphasis" w:semiHidden="0" w:uiPriority="19" w:unhideWhenUsed="0" w:qFormat="1"/>
-    <w:lsdException w:name="Intense Emphasis" w:semiHidden="0" w:uiPriority="21" w:unhideWhenUsed="0" w:qFormat="1"/>
-    <w:lsdException w:name="Subtle Reference" w:semiHidden="0" w:uiPriority="31" w:unhideWhenUsed="0" w:qFormat="1"/>
-    <w:lsdException w:name="Intense Reference" w:semiHidden="0" w:uiPriority="32" w:unhideWhenUsed="0" w:qFormat="1"/>
-    <w:lsdException w:name="Book Title" w:semiHidden="0" w:uiPriority="33" w:unhideWhenUsed="0" w:qFormat="1"/>
-    <w:lsdException w:name="Bibliography" w:uiPriority="37"/>
-    <w:lsdException w:name="TOC Heading" w:uiPriority="39" w:qFormat="1"/>
+  <w:latentStyles w:defLockedState="0" w:defUIPriority="99" w:defSemiHidden="0" w:defUnhideWhenUsed="0" w:defQFormat="0" w:count="376">
+    <w:lsdException w:name="Normal" w:uiPriority="1" w:qFormat="1"/>
+    <w:lsdException w:name="heading 1" w:uiPriority="1" w:qFormat="1"/>
+    <w:lsdException w:name="heading 2" w:semiHidden="1" w:uiPriority="1" w:unhideWhenUsed="1" w:qFormat="1"/>
+    <w:lsdException w:name="heading 3" w:semiHidden="1" w:uiPriority="1" w:unhideWhenUsed="1" w:qFormat="1"/>
+    <w:lsdException w:name="heading 4" w:semiHidden="1" w:uiPriority="9" w:unhideWhenUsed="1" w:qFormat="1"/>
+    <w:lsdException w:name="heading 5" w:semiHidden="1" w:uiPriority="9" w:unhideWhenUsed="1" w:qFormat="1"/>
+    <w:lsdException w:name="heading 6" w:semiHidden="1" w:uiPriority="9" w:unhideWhenUsed="1" w:qFormat="1"/>
+    <w:lsdException w:name="heading 7" w:semiHidden="1" w:uiPriority="9" w:unhideWhenUsed="1" w:qFormat="1"/>
+    <w:lsdException w:name="heading 8" w:semiHidden="1" w:uiPriority="9" w:unhideWhenUsed="1" w:qFormat="1"/>
+    <w:lsdException w:name="heading 9" w:semiHidden="1" w:uiPriority="9" w:unhideWhenUsed="1" w:qFormat="1"/>
+    <w:lsdException w:name="index 1" w:semiHidden="1" w:unhideWhenUsed="1"/>
+    <w:lsdException w:name="index 2" w:semiHidden="1" w:unhideWhenUsed="1"/>
+    <w:lsdException w:name="index 3" w:semiHidden="1" w:unhideWhenUsed="1"/>
+    <w:lsdException w:name="index 4" w:semiHidden="1" w:unhideWhenUsed="1"/>
+    <w:lsdException w:name="index 5" w:semiHidden="1" w:unhideWhenUsed="1"/>
+    <w:lsdException w:name="index 6" w:semiHidden="1" w:unhideWhenUsed="1"/>
+    <w:lsdException w:name="index 7" w:semiHidden="1" w:unhideWhenUsed="1"/>
+    <w:lsdException w:name="index 8" w:semiHidden="1" w:unhideWhenUsed="1"/>
+    <w:lsdException w:name="index 9" w:semiHidden="1" w:unhideWhenUsed="1"/>
+    <w:lsdException w:name="toc 1" w:semiHidden="1" w:uiPriority="39" w:unhideWhenUsed="1"/>
+    <w:lsdException w:name="toc 2" w:semiHidden="1" w:uiPriority="39" w:unhideWhenUsed="1"/>
+    <w:lsdException w:name="toc 3" w:semiHidden="1" w:uiPriority="39" w:unhideWhenUsed="1"/>
+    <w:lsdException w:name="toc 4" w:semiHidden="1" w:uiPriority="39" w:unhideWhenUsed="1"/>
+    <w:lsdException w:name="toc 5" w:semiHidden="1" w:uiPriority="39" w:unhideWhenUsed="1"/>
+    <w:lsdException w:name="toc 6" w:semiHidden="1" w:uiPriority="39" w:unhideWhenUsed="1"/>
+    <w:lsdException w:name="toc 7" w:semiHidden="1" w:uiPriority="39" w:unhideWhenUsed="1"/>
+    <w:lsdException w:name="toc 8" w:semiHidden="1" w:uiPriority="39" w:unhideWhenUsed="1"/>
+    <w:lsdException w:name="toc 9" w:semiHidden="1" w:uiPriority="39" w:unhideWhenUsed="1"/>
+    <w:lsdException w:name="Normal Indent" w:semiHidden="1" w:unhideWhenUsed="1"/>
+    <w:lsdException w:name="footnote text" w:semiHidden="1" w:unhideWhenUsed="1"/>
+    <w:lsdException w:name="annotation text" w:semiHidden="1" w:unhideWhenUsed="1"/>
+    <w:lsdException w:name="header" w:semiHidden="1" w:unhideWhenUsed="1"/>
+    <w:lsdException w:name="footer" w:semiHidden="1" w:unhideWhenUsed="1"/>
+    <w:lsdException w:name="index heading" w:semiHidden="1" w:unhideWhenUsed="1"/>
+    <w:lsdException w:name="caption" w:semiHidden="1" w:uiPriority="35" w:unhideWhenUsed="1" w:qFormat="1"/>
+    <w:lsdException w:name="table of figures" w:semiHidden="1" w:unhideWhenUsed="1"/>
+    <w:lsdException w:name="envelope address" w:semiHidden="1" w:unhideWhenUsed="1"/>
+    <w:lsdException w:name="envelope return" w:semiHidden="1" w:unhideWhenUsed="1"/>
+    <w:lsdException w:name="footnote reference" w:semiHidden="1" w:unhideWhenUsed="1"/>
+    <w:lsdException w:name="annotation reference" w:semiHidden="1" w:unhideWhenUsed="1"/>
+    <w:lsdException w:name="line number" w:semiHidden="1" w:unhideWhenUsed="1"/>
+    <w:lsdException w:name="page number" w:semiHidden="1" w:unhideWhenUsed="1"/>
+    <w:lsdException w:name="endnote reference" w:semiHidden="1" w:unhideWhenUsed="1"/>
+    <w:lsdException w:name="endnote text" w:semiHidden="1" w:unhideWhenUsed="1"/>
+    <w:lsdException w:name="table of authorities" w:semiHidden="1" w:unhideWhenUsed="1"/>
+    <w:lsdException w:name="macro" w:semiHidden="1" w:unhideWhenUsed="1"/>
+    <w:lsdException w:name="toa heading" w:semiHidden="1" w:unhideWhenUsed="1"/>
+    <w:lsdException w:name="List" w:semiHidden="1" w:unhideWhenUsed="1"/>
+    <w:lsdException w:name="List Bullet" w:semiHidden="1" w:unhideWhenUsed="1"/>
+    <w:lsdException w:name="List Number" w:semiHidden="1" w:unhideWhenUsed="1"/>
+    <w:lsdException w:name="List 2" w:semiHidden="1" w:unhideWhenUsed="1"/>
+    <w:lsdException w:name="List 3" w:semiHidden="1" w:unhideWhenUsed="1"/>
+    <w:lsdException w:name="List 4" w:semiHidden="1" w:unhideWhenUsed="1"/>
+    <w:lsdException w:name="List 5" w:semiHidden="1" w:unhideWhenUsed="1"/>
+    <w:lsdException w:name="List Bullet 2" w:semiHidden="1" w:unhideWhenUsed="1"/>
+    <w:lsdException w:name="List Bullet 3" w:semiHidden="1" w:unhideWhenUsed="1"/>
+    <w:lsdException w:name="List Bullet 4" w:semiHidden="1" w:unhideWhenUsed="1"/>
+    <w:lsdException w:name="List Bullet 5" w:semiHidden="1" w:unhideWhenUsed="1"/>
+    <w:lsdException w:name="List Number 2" w:semiHidden="1" w:unhideWhenUsed="1"/>
+    <w:lsdException w:name="List Number 3" w:semiHidden="1" w:unhideWhenUsed="1"/>
+    <w:lsdException w:name="List Number 4" w:semiHidden="1" w:unhideWhenUsed="1"/>
+    <w:lsdException w:name="List Number 5" w:semiHidden="1" w:unhideWhenUsed="1"/>
+    <w:lsdException w:name="Title" w:uiPriority="1" w:qFormat="1"/>
+    <w:lsdException w:name="Closing" w:semiHidden="1" w:unhideWhenUsed="1"/>
+    <w:lsdException w:name="Signature" w:semiHidden="1" w:unhideWhenUsed="1"/>
+    <w:lsdException w:name="Default Paragraph Font" w:semiHidden="1" w:uiPriority="1" w:unhideWhenUsed="1"/>
+    <w:lsdException w:name="Body Text" w:semiHidden="1" w:uiPriority="1" w:unhideWhenUsed="1" w:qFormat="1"/>
+    <w:lsdException w:name="Body Text Indent" w:semiHidden="1" w:unhideWhenUsed="1"/>
+    <w:lsdException w:name="List Continue" w:semiHidden="1" w:unhideWhenUsed="1"/>
+    <w:lsdException w:name="List Continue 2" w:semiHidden="1" w:unhideWhenUsed="1"/>
+    <w:lsdException w:name="List Continue 3" w:semiHidden="1" w:unhideWhenUsed="1"/>
+    <w:lsdException w:name="List Continue 4" w:semiHidden="1" w:unhideWhenUsed="1"/>
+    <w:lsdException w:name="List Continue 5" w:semiHidden="1" w:unhideWhenUsed="1"/>
+    <w:lsdException w:name="Message Header" w:semiHidden="1" w:unhideWhenUsed="1"/>
+    <w:lsdException w:name="Subtitle" w:uiPriority="11" w:qFormat="1"/>
+    <w:lsdException w:name="Salutation" w:semiHidden="1" w:unhideWhenUsed="1"/>
+    <w:lsdException w:name="Date" w:semiHidden="1" w:unhideWhenUsed="1"/>
+    <w:lsdException w:name="Body Text First Indent" w:semiHidden="1" w:unhideWhenUsed="1"/>
+    <w:lsdException w:name="Body Text First Indent 2" w:semiHidden="1" w:unhideWhenUsed="1"/>
+    <w:lsdException w:name="Note Heading" w:semiHidden="1" w:unhideWhenUsed="1"/>
+    <w:lsdException w:name="Body Text 2" w:semiHidden="1" w:unhideWhenUsed="1"/>
+    <w:lsdException w:name="Body Text 3" w:semiHidden="1" w:unhideWhenUsed="1"/>
+    <w:lsdException w:name="Body Text Indent 2" w:semiHidden="1" w:unhideWhenUsed="1"/>
+    <w:lsdException w:name="Body Text Indent 3" w:semiHidden="1" w:unhideWhenUsed="1"/>
+    <w:lsdException w:name="Block Text" w:semiHidden="1" w:unhideWhenUsed="1"/>
+    <w:lsdException w:name="Hyperlink" w:semiHidden="1" w:unhideWhenUsed="1"/>
+    <w:lsdException w:name="FollowedHyperlink" w:semiHidden="1" w:unhideWhenUsed="1"/>
+    <w:lsdException w:name="Strong" w:uiPriority="22" w:qFormat="1"/>
+    <w:lsdException w:name="Emphasis" w:uiPriority="20" w:qFormat="1"/>
+    <w:lsdException w:name="Document Map" w:semiHidden="1" w:unhideWhenUsed="1"/>
+    <w:lsdException w:name="Plain Text" w:semiHidden="1" w:unhideWhenUsed="1"/>
+    <w:lsdException w:name="E-mail Signature" w:semiHidden="1" w:unhideWhenUsed="1"/>
+    <w:lsdException w:name="HTML Top of Form" w:semiHidden="1" w:unhideWhenUsed="1"/>
+    <w:lsdException w:name="HTML Bottom of Form" w:semiHidden="1" w:unhideWhenUsed="1"/>
+    <w:lsdException w:name="Normal (Web)" w:semiHidden="1" w:unhideWhenUsed="1"/>
+    <w:lsdException w:name="HTML Acronym" w:semiHidden="1" w:unhideWhenUsed="1"/>
+    <w:lsdException w:name="HTML Address" w:semiHidden="1" w:unhideWhenUsed="1"/>
+    <w:lsdException w:name="HTML Cite" w:semiHidden="1" w:unhideWhenUsed="1"/>
+    <w:lsdException w:name="HTML Code" w:semiHidden="1" w:unhideWhenUsed="1"/>
+    <w:lsdException w:name="HTML Definition" w:semiHidden="1" w:unhideWhenUsed="1"/>
+    <w:lsdException w:name="HTML Keyboard" w:semiHidden="1" w:unhideWhenUsed="1"/>
+    <w:lsdException w:name="HTML Preformatted" w:semiHidden="1" w:unhideWhenUsed="1"/>
+    <w:lsdException w:name="HTML Sample" w:semiHidden="1" w:unhideWhenUsed="1"/>
+    <w:lsdException w:name="HTML Typewriter" w:semiHidden="1" w:unhideWhenUsed="1"/>
+    <w:lsdException w:name="HTML Variable" w:semiHidden="1" w:unhideWhenUsed="1"/>
+    <w:lsdException w:name="Normal Table" w:semiHidden="1" w:unhideWhenUsed="1"/>
+    <w:lsdException w:name="annotation subject" w:semiHidden="1" w:unhideWhenUsed="1"/>
+    <w:lsdException w:name="No List" w:semiHidden="1" w:unhideWhenUsed="1"/>
+    <w:lsdException w:name="Outline List 1" w:semiHidden="1" w:unhideWhenUsed="1"/>
+    <w:lsdException w:name="Outline List 2" w:semiHidden="1" w:unhideWhenUsed="1"/>
+    <w:lsdException w:name="Outline List 3" w:semiHidden="1" w:unhideWhenUsed="1"/>
+    <w:lsdException w:name="Table Simple 1" w:semiHidden="1" w:unhideWhenUsed="1"/>
+    <w:lsdException w:name="Table Simple 2" w:semiHidden="1" w:unhideWhenUsed="1"/>
+    <w:lsdException w:name="Table Simple 3" w:semiHidden="1" w:unhideWhenUsed="1"/>
+    <w:lsdException w:name="Table Classic 1" w:semiHidden="1" w:unhideWhenUsed="1"/>
+    <w:lsdException w:name="Table Classic 2" w:semiHidden="1" w:unhideWhenUsed="1"/>
+    <w:lsdException w:name="Table Classic 3" w:semiHidden="1" w:unhideWhenUsed="1"/>
+    <w:lsdException w:name="Table Classic 4" w:semiHidden="1" w:unhideWhenUsed="1"/>
+    <w:lsdException w:name="Table Colorful 1" w:semiHidden="1" w:unhideWhenUsed="1"/>
+    <w:lsdException w:name="Table Colorful 2" w:semiHidden="1" w:unhideWhenUsed="1"/>
+    <w:lsdException w:name="Table Colorful 3" w:semiHidden="1" w:unhideWhenUsed="1"/>
+    <w:lsdException w:name="Table Columns 1" w:semiHidden="1" w:unhideWhenUsed="1"/>
+    <w:lsdException w:name="Table Columns 2" w:semiHidden="1" w:unhideWhenUsed="1"/>
+    <w:lsdException w:name="Table Columns 3" w:semiHidden="1" w:unhideWhenUsed="1"/>
+    <w:lsdException w:name="Table Columns 4" w:semiHidden="1" w:unhideWhenUsed="1"/>
+    <w:lsdException w:name="Table Columns 5" w:semiHidden="1" w:unhideWhenUsed="1"/>
+    <w:lsdException w:name="Table Grid 1" w:semiHidden="1" w:unhideWhenUsed="1"/>
+    <w:lsdException w:name="Table Grid 2" w:semiHidden="1" w:unhideWhenUsed="1"/>
+    <w:lsdException w:name="Table Grid 3" w:semiHidden="1" w:unhideWhenUsed="1"/>
+    <w:lsdException w:name="Table Grid 4" w:semiHidden="1" w:unhideWhenUsed="1"/>
+    <w:lsdException w:name="Table Grid 5" w:semiHidden="1" w:unhideWhenUsed="1"/>
+    <w:lsdException w:name="Table Grid 6" w:semiHidden="1" w:unhideWhenUsed="1"/>
+    <w:lsdException w:name="Table Grid 7" w:semiHidden="1" w:unhideWhenUsed="1"/>
+    <w:lsdException w:name="Table Grid 8" w:semiHidden="1" w:unhideWhenUsed="1"/>
+    <w:lsdException w:name="Table List 1" w:semiHidden="1" w:unhideWhenUsed="1"/>
+    <w:lsdException w:name="Table List 2" w:semiHidden="1" w:unhideWhenUsed="1"/>
+    <w:lsdException w:name="Table List 3" w:semiHidden="1" w:unhideWhenUsed="1"/>
+    <w:lsdException w:name="Table List 4" w:semiHidden="1" w:unhideWhenUsed="1"/>
+    <w:lsdException w:name="Table List 5" w:semiHidden="1" w:unhideWhenUsed="1"/>
+    <w:lsdException w:name="Table List 6" w:semiHidden="1" w:unhideWhenUsed="1"/>
+    <w:lsdException w:name="Table List 7" w:semiHidden="1" w:unhideWhenUsed="1"/>
+    <w:lsdException w:name="Table List 8" w:semiHidden="1" w:unhideWhenUsed="1"/>
+    <w:lsdException w:name="Table 3D effects 1" w:semiHidden="1" w:unhideWhenUsed="1"/>
+    <w:lsdException w:name="Table 3D effects 2" w:semiHidden="1" w:unhideWhenUsed="1"/>
+    <w:lsdException w:name="Table 3D effects 3" w:semiHidden="1" w:unhideWhenUsed="1"/>
+    <w:lsdException w:name="Table Contemporary" w:semiHidden="1" w:unhideWhenUsed="1"/>
+    <w:lsdException w:name="Table Elegant" w:semiHidden="1" w:unhideWhenUsed="1"/>
+    <w:lsdException w:name="Table Professional" w:semiHidden="1" w:unhideWhenUsed="1"/>
+    <w:lsdException w:name="Table Subtle 1" w:semiHidden="1" w:unhideWhenUsed="1"/>
+    <w:lsdException w:name="Table Subtle 2" w:semiHidden="1" w:unhideWhenUsed="1"/>
+    <w:lsdException w:name="Table Web 1" w:semiHidden="1" w:unhideWhenUsed="1"/>
+    <w:lsdException w:name="Table Web 2" w:semiHidden="1" w:unhideWhenUsed="1"/>
+    <w:lsdException w:name="Table Web 3" w:semiHidden="1" w:unhideWhenUsed="1"/>
+    <w:lsdException w:name="Balloon Text" w:semiHidden="1" w:unhideWhenUsed="1"/>
+    <w:lsdException w:name="Table Grid" w:uiPriority="59"/>
+    <w:lsdException w:name="Table Theme" w:semiHidden="1" w:unhideWhenUsed="1"/>
+    <w:lsdException w:name="Placeholder Text" w:semiHidden="1"/>
+    <w:lsdException w:name="No Spacing" w:uiPriority="1" w:qFormat="1"/>
+    <w:lsdException w:name="Light Shading" w:uiPriority="60"/>
+    <w:lsdException w:name="Light List" w:uiPriority="61"/>
+    <w:lsdException w:name="Light Grid" w:uiPriority="62"/>
+    <w:lsdException w:name="Medium Shading 1" w:uiPriority="63"/>
+    <w:lsdException w:name="Medium Shading 2" w:uiPriority="64"/>
+    <w:lsdException w:name="Medium List 1" w:uiPriority="65"/>
+    <w:lsdException w:name="Medium List 2" w:uiPriority="66"/>
+    <w:lsdException w:name="Medium Grid 1" w:uiPriority="67"/>
+    <w:lsdException w:name="Medium Grid 2" w:uiPriority="68"/>
+    <w:lsdException w:name="Medium Grid 3" w:uiPriority="69"/>
+    <w:lsdException w:name="Dark List" w:uiPriority="70"/>
+    <w:lsdException w:name="Colorful Shading" w:uiPriority="71"/>
+    <w:lsdException w:name="Colorful List" w:uiPriority="72"/>
+    <w:lsdException w:name="Colorful Grid" w:uiPriority="73"/>
+    <w:lsdException w:name="Light Shading Accent 1" w:uiPriority="60"/>
+    <w:lsdException w:name="Light List Accent 1" w:uiPriority="61"/>
+    <w:lsdException w:name="Light Grid Accent 1" w:uiPriority="62"/>
+    <w:lsdException w:name="Medium Shading 1 Accent 1" w:uiPriority="63"/>
+    <w:lsdException w:name="Medium Shading 2 Accent 1" w:uiPriority="64"/>
+    <w:lsdException w:name="Medium List 1 Accent 1" w:uiPriority="65"/>
+    <w:lsdException w:name="Revision" w:semiHidden="1"/>
+    <w:lsdException w:name="List Paragraph" w:uiPriority="1" w:qFormat="1"/>
+    <w:lsdException w:name="Quote" w:uiPriority="29" w:qFormat="1"/>
+    <w:lsdException w:name="Intense Quote" w:uiPriority="30" w:qFormat="1"/>
+    <w:lsdException w:name="Medium List 2 Accent 1" w:uiPriority="66"/>
+    <w:lsdException w:name="Medium Grid 1 Accent 1" w:uiPriority="67"/>
+    <w:lsdException w:name="Medium Grid 2 Accent 1" w:uiPriority="68"/>
+    <w:lsdException w:name="Medium Grid 3 Accent 1" w:uiPriority="69"/>
+    <w:lsdException w:name="Dark List Accent 1" w:uiPriority="70"/>
+    <w:lsdException w:name="Colorful Shading Accent 1" w:uiPriority="71"/>
+    <w:lsdException w:name="Colorful List Accent 1" w:uiPriority="72"/>
+    <w:lsdException w:name="Colorful Grid Accent 1" w:uiPriority="73"/>
+    <w:lsdException w:name="Light Shading Accent 2" w:uiPriority="60"/>
+    <w:lsdException w:name="Light List Accent 2" w:uiPriority="61"/>
+    <w:lsdException w:name="Light Grid Accent 2" w:uiPriority="62"/>
+    <w:lsdException w:name="Medium Shading 1 Accent 2" w:uiPriority="63"/>
+    <w:lsdException w:name="Medium Shading 2 Accent 2" w:uiPriority="64"/>
+    <w:lsdException w:name="Medium List 1 Accent 2" w:uiPriority="65"/>
+    <w:lsdException w:name="Medium List 2 Accent 2" w:uiPriority="66"/>
+    <w:lsdException w:name="Medium Grid 1 Accent 2" w:uiPriority="67"/>
+    <w:lsdException w:name="Medium Grid 2 Accent 2" w:uiPriority="68"/>
+    <w:lsdException w:name="Medium Grid 3 Accent 2" w:uiPriority="69"/>
+    <w:lsdException w:name="Dark List Accent 2" w:uiPriority="70"/>
+    <w:lsdException w:name="Colorful Shading Accent 2" w:uiPriority="71"/>
+    <w:lsdException w:name="Colorful List Accent 2" w:uiPriority="72"/>
+    <w:lsdException w:name="Colorful Grid Accent 2" w:uiPriority="73"/>
+    <w:lsdException w:name="Light Shading Accent 3" w:uiPriority="60"/>
+    <w:lsdException w:name="Light List Accent 3" w:uiPriority="61"/>
+    <w:lsdException w:name="Light Grid Accent 3" w:uiPriority="62"/>
+    <w:lsdException w:name="Medium Shading 1 Accent 3" w:uiPriority="63"/>
+    <w:lsdException w:name="Medium Shading 2 Accent 3" w:uiPriority="64"/>
+    <w:lsdException w:name="Medium List 1 Accent 3" w:uiPriority="65"/>
+    <w:lsdException w:name="Medium List 2 Accent 3" w:uiPriority="66"/>
+    <w:lsdException w:name="Medium Grid 1 Accent 3" w:uiPriority="67"/>
+    <w:lsdException w:name="Medium Grid 2 Accent 3" w:uiPriority="68"/>
+    <w:lsdException w:name="Medium Grid 3 Accent 3" w:uiPriority="69"/>
+    <w:lsdException w:name="Dark List Accent 3" w:uiPriority="70"/>
+    <w:lsdException w:name="Colorful Shading Accent 3" w:uiPriority="71"/>
+    <w:lsdException w:name="Colorful List Accent 3" w:uiPriority="72"/>
+    <w:lsdException w:name="Colorful Grid Accent 3" w:uiPriority="73"/>
+    <w:lsdException w:name="Light Shading Accent 4" w:uiPriority="60"/>
+    <w:lsdException w:name="Light List Accent 4" w:uiPriority="61"/>
+    <w:lsdException w:name="Light Grid Accent 4" w:uiPriority="62"/>
+    <w:lsdException w:name="Medium Shading 1 Accent 4" w:uiPriority="63"/>
+    <w:lsdException w:name="Medium Shading 2 Accent 4" w:uiPriority="64"/>
+    <w:lsdException w:name="Medium List 1 Accent 4" w:uiPriority="65"/>
+    <w:lsdException w:name="Medium List 2 Accent 4" w:uiPriority="66"/>
+    <w:lsdException w:name="Medium Grid 1 Accent 4" w:uiPriority="67"/>
+    <w:lsdException w:name="Medium Grid 2 Accent 4" w:uiPriority="68"/>
+    <w:lsdException w:name="Medium Grid 3 Accent 4" w:uiPriority="69"/>
+    <w:lsdException w:name="Dark List Accent 4" w:uiPriority="70"/>
+    <w:lsdException w:name="Colorful Shading Accent 4" w:uiPriority="71"/>
+    <w:lsdException w:name="Colorful List Accent 4" w:uiPriority="72"/>
+    <w:lsdException w:name="Colorful Grid Accent 4" w:uiPriority="73"/>
+    <w:lsdException w:name="Light Shading Accent 5" w:uiPriority="60"/>
+    <w:lsdException w:name="Light List Accent 5" w:uiPriority="61"/>
+    <w:lsdException w:name="Light Grid Accent 5" w:uiPriority="62"/>
+    <w:lsdException w:name="Medium Shading 1 Accent 5" w:uiPriority="63"/>
+    <w:lsdException w:name="Medium Shading 2 Accent 5" w:uiPriority="64"/>
+    <w:lsdException w:name="Medium List 1 Accent 5" w:uiPriority="65"/>
+    <w:lsdException w:name="Medium List 2 Accent 5" w:uiPriority="66"/>
+    <w:lsdException w:name="Medium Grid 1 Accent 5" w:uiPriority="67"/>
+    <w:lsdException w:name="Medium Grid 2 Accent 5" w:uiPriority="68"/>
+    <w:lsdException w:name="Medium Grid 3 Accent 5" w:uiPriority="69"/>
+    <w:lsdException w:name="Dark List Accent 5" w:uiPriority="70"/>
+    <w:lsdException w:name="Colorful Shading Accent 5" w:uiPriority="71"/>
+    <w:lsdException w:name="Colorful List Accent 5" w:uiPriority="72"/>
+    <w:lsdException w:name="Colorful Grid Accent 5" w:uiPriority="73"/>
+    <w:lsdException w:name="Light Shading Accent 6" w:uiPriority="60"/>
+    <w:lsdException w:name="Light List Accent 6" w:uiPriority="61"/>
+    <w:lsdException w:name="Light Grid Accent 6" w:uiPriority="62"/>
+    <w:lsdException w:name="Medium Shading 1 Accent 6" w:uiPriority="63"/>
+    <w:lsdException w:name="Medium Shading 2 Accent 6" w:uiPriority="64"/>
+    <w:lsdException w:name="Medium List 1 Accent 6" w:uiPriority="65"/>
+    <w:lsdException w:name="Medium List 2 Accent 6" w:uiPriority="66"/>
+    <w:lsdException w:name="Medium Grid 1 Accent 6" w:uiPriority="67"/>
+    <w:lsdException w:name="Medium Grid 2 Accent 6" w:uiPriority="68"/>
+    <w:lsdException w:name="Medium Grid 3 Accent 6" w:uiPriority="69"/>
+    <w:lsdException w:name="Dark List Accent 6" w:uiPriority="70"/>
+    <w:lsdException w:name="Colorful Shading Accent 6" w:uiPriority="71"/>
+    <w:lsdException w:name="Colorful List Accent 6" w:uiPriority="72"/>
+    <w:lsdException w:name="Colorful Grid Accent 6" w:uiPriority="73"/>
+    <w:lsdException w:name="Subtle Emphasis" w:uiPriority="19" w:qFormat="1"/>
+    <w:lsdException w:name="Intense Emphasis" w:uiPriority="21" w:qFormat="1"/>
+    <w:lsdException w:name="Subtle Reference" w:uiPriority="31" w:qFormat="1"/>
+    <w:lsdException w:name="Intense Reference" w:uiPriority="32" w:qFormat="1"/>
+    <w:lsdException w:name="Book Title" w:uiPriority="33" w:qFormat="1"/>
+    <w:lsdException w:name="Bibliography" w:semiHidden="1" w:uiPriority="37" w:unhideWhenUsed="1"/>
+    <w:lsdException w:name="TOC Heading" w:semiHidden="1" w:uiPriority="39" w:unhideWhenUsed="1" w:qFormat="1"/>
+    <w:lsdException w:name="Plain Table 1" w:uiPriority="41"/>
+    <w:lsdException w:name="Plain Table 2" w:uiPriority="42"/>
+    <w:lsdException w:name="Plain Table 3" w:uiPriority="43"/>
+    <w:lsdException w:name="Plain Table 4" w:uiPriority="44"/>
+    <w:lsdException w:name="Plain Table 5" w:uiPriority="45"/>
+    <w:lsdException w:name="Grid Table Light" w:uiPriority="40"/>
+    <w:lsdException w:name="Grid Table 1 Light" w:uiPriority="46"/>
+    <w:lsdException w:name="Grid Table 2" w:uiPriority="47"/>
+    <w:lsdException w:name="Grid Table 3" w:uiPriority="48"/>
+    <w:lsdException w:name="Grid Table 4" w:uiPriority="49"/>
+    <w:lsdException w:name="Grid Table 5 Dark" w:uiPriority="50"/>
+    <w:lsdException w:name="Grid Table 6 Colorful" w:uiPriority="51"/>
+    <w:lsdException w:name="Grid Table 7 Colorful" w:uiPriority="52"/>
+    <w:lsdException w:name="Grid Table 1 Light Accent 1" w:uiPriority="46"/>
+    <w:lsdException w:name="Grid Table 2 Accent 1" w:uiPriority="47"/>
+    <w:lsdException w:name="Grid Table 3 Accent 1" w:uiPriority="48"/>
+    <w:lsdException w:name="Grid Table 4 Accent 1" w:uiPriority="49"/>
+    <w:lsdException w:name="Grid Table 5 Dark Accent 1" w:uiPriority="50"/>
+    <w:lsdException w:name="Grid Table 6 Colorful Accent 1" w:uiPriority="51"/>
+    <w:lsdException w:name="Grid Table 7 Colorful Accent 1" w:uiPriority="52"/>
+    <w:lsdException w:name="Grid Table 1 Light Accent 2" w:uiPriority="46"/>
+    <w:lsdException w:name="Grid Table 2 Accent 2" w:uiPriority="47"/>
+    <w:lsdException w:name="Grid Table 3 Accent 2" w:uiPriority="48"/>
+    <w:lsdException w:name="Grid Table 4 Accent 2" w:uiPriority="49"/>
+    <w:lsdException w:name="Grid Table 5 Dark Accent 2" w:uiPriority="50"/>
+    <w:lsdException w:name="Grid Table 6 Colorful Accent 2" w:uiPriority="51"/>
+    <w:lsdException w:name="Grid Table 7 Colorful Accent 2" w:uiPriority="52"/>
+    <w:lsdException w:name="Grid Table 1 Light Accent 3" w:uiPriority="46"/>
+    <w:lsdException w:name="Grid Table 2 Accent 3" w:uiPriority="47"/>
+    <w:lsdException w:name="Grid Table 3 Accent 3" w:uiPriority="48"/>
+    <w:lsdException w:name="Grid Table 4 Accent 3" w:uiPriority="49"/>
+    <w:lsdException w:name="Grid Table 5 Dark Accent 3" w:uiPriority="50"/>
+    <w:lsdException w:name="Grid Table 6 Colorful Accent 3" w:uiPriority="51"/>
+    <w:lsdException w:name="Grid Table 7 Colorful Accent 3" w:uiPriority="52"/>
+    <w:lsdException w:name="Grid Table 1 Light Accent 4" w:uiPriority="46"/>
+    <w:lsdException w:name="Grid Table 2 Accent 4" w:uiPriority="47"/>
+    <w:lsdException w:name="Grid Table 3 Accent 4" w:uiPriority="48"/>
+    <w:lsdException w:name="Grid Table 4 Accent 4" w:uiPriority="49"/>
+    <w:lsdException w:name="Grid Table 5 Dark Accent 4" w:uiPriority="50"/>
+    <w:lsdException w:name="Grid Table 6 Colorful Accent 4" w:uiPriority="51"/>
+    <w:lsdException w:name="Grid Table 7 Colorful Accent 4" w:uiPriority="52"/>
+    <w:lsdException w:name="Grid Table 1 Light Accent 5" w:uiPriority="46"/>
+    <w:lsdException w:name="Grid Table 2 Accent 5" w:uiPriority="47"/>
+    <w:lsdException w:name="Grid Table 3 Accent 5" w:uiPriority="48"/>
+    <w:lsdException w:name="Grid Table 4 Accent 5" w:uiPriority="49"/>
+    <w:lsdException w:name="Grid Table 5 Dark Accent 5" w:uiPriority="50"/>
+    <w:lsdException w:name="Grid Table 6 Colorful Accent 5" w:uiPriority="51"/>
+    <w:lsdException w:name="Grid Table 7 Colorful Accent 5" w:uiPriority="52"/>
+    <w:lsdException w:name="Grid Table 1 Light Accent 6" w:uiPriority="46"/>
+    <w:lsdException w:name="Grid Table 2 Accent 6" w:uiPriority="47"/>
+    <w:lsdException w:name="Grid Table 3 Accent 6" w:uiPriority="48"/>
+    <w:lsdException w:name="Grid Table 4 Accent 6" w:uiPriority="49"/>
+    <w:lsdException w:name="Grid Table 5 Dark Accent 6" w:uiPriority="50"/>
+    <w:lsdException w:name="Grid Table 6 Colorful Accent 6" w:uiPriority="51"/>
+    <w:lsdException w:name="Grid Table 7 Colorful Accent 6" w:uiPriority="52"/>
+    <w:lsdException w:name="List Table 1 Light" w:uiPriority="46"/>
+    <w:lsdException w:name="List Table 2" w:uiPriority="47"/>
+    <w:lsdException w:name="List Table 3" w:uiPriority="48"/>
+    <w:lsdException w:name="List Table 4" w:uiPriority="49"/>
+    <w:lsdException w:name="List Table 5 Dark" w:uiPriority="50"/>
+    <w:lsdException w:name="List Table 6 Colorful" w:uiPriority="51"/>
+    <w:lsdException w:name="List Table 7 Colorful" w:uiPriority="52"/>
+    <w:lsdException w:name="List Table 1 Light Accent 1" w:uiPriority="46"/>
+    <w:lsdException w:name="List Table 2 Accent 1" w:uiPriority="47"/>
+    <w:lsdException w:name="List Table 3 Accent 1" w:uiPriority="48"/>
+    <w:lsdException w:name="List Table 4 Accent 1" w:uiPriority="49"/>
+    <w:lsdException w:name="List Table 5 Dark Accent 1" w:uiPriority="50"/>
+    <w:lsdException w:name="List Table 6 Colorful Accent 1" w:uiPriority="51"/>
+    <w:lsdException w:name="List Table 7 Colorful Accent 1" w:uiPriority="52"/>
+    <w:lsdException w:name="List Table 1 Light Accent 2" w:uiPriority="46"/>
+    <w:lsdException w:name="List Table 2 Accent 2" w:uiPriority="47"/>
+    <w:lsdException w:name="List Table 3 Accent 2" w:uiPriority="48"/>
+    <w:lsdException w:name="List Table 4 Accent 2" w:uiPriority="49"/>
+    <w:lsdException w:name="List Table 5 Dark Accent 2" w:uiPriority="50"/>
+    <w:lsdException w:name="List Table 6 Colorful Accent 2" w:uiPriority="51"/>
+    <w:lsdException w:name="List Table 7 Colorful Accent 2" w:uiPriority="52"/>
+    <w:lsdException w:name="List Table 1 Light Accent 3" w:uiPriority="46"/>
+    <w:lsdException w:name="List Table 2 Accent 3" w:uiPriority="47"/>
+    <w:lsdException w:name="List Table 3 Accent 3" w:uiPriority="48"/>
+    <w:lsdException w:name="List Table 4 Accent 3" w:uiPriority="49"/>
+    <w:lsdException w:name="List Table 5 Dark Accent 3" w:uiPriority="50"/>
+    <w:lsdException w:name="List Table 6 Colorful Accent 3" w:uiPriority="51"/>
+    <w:lsdException w:name="List Table 7 Colorful Accent 3" w:uiPriority="52"/>
+    <w:lsdException w:name="List Table 1 Light Accent 4" w:uiPriority="46"/>
+    <w:lsdException w:name="List Table 2 Accent 4" w:uiPriority="47"/>
+    <w:lsdException w:name="List Table 3 Accent 4" w:uiPriority="48"/>
+    <w:lsdException w:name="List Table 4 Accent 4" w:uiPriority="49"/>
+    <w:lsdException w:name="List Table 5 Dark Accent 4" w:uiPriority="50"/>
+    <w:lsdException w:name="List Table 6 Colorful Accent 4" w:uiPriority="51"/>
+    <w:lsdException w:name="List Table 7 Colorful Accent 4" w:uiPriority="52"/>
+    <w:lsdException w:name="List Table 1 Light Accent 5" w:uiPriority="46"/>
+    <w:lsdException w:name="List Table 2 Accent 5" w:uiPriority="47"/>
+    <w:lsdException w:name="List Table 3 Accent 5" w:uiPriority="48"/>
+    <w:lsdException w:name="List Table 4 Accent 5" w:uiPriority="49"/>
+    <w:lsdException w:name="List Table 5 Dark Accent 5" w:uiPriority="50"/>
+    <w:lsdException w:name="List Table 6 Colorful Accent 5" w:uiPriority="51"/>
+    <w:lsdException w:name="List Table 7 Colorful Accent 5" w:uiPriority="52"/>
+    <w:lsdException w:name="List Table 1 Light Accent 6" w:uiPriority="46"/>
+    <w:lsdException w:name="List Table 2 Accent 6" w:uiPriority="47"/>
+    <w:lsdException w:name="List Table 3 Accent 6" w:uiPriority="48"/>
+    <w:lsdException w:name="List Table 4 Accent 6" w:uiPriority="49"/>
+    <w:lsdException w:name="List Table 5 Dark Accent 6" w:uiPriority="50"/>
+    <w:lsdException w:name="List Table 6 Colorful Accent 6" w:uiPriority="51"/>
+    <w:lsdException w:name="List Table 7 Colorful Accent 6" w:uiPriority="52"/>
+    <w:lsdException w:name="Mention" w:semiHidden="1" w:unhideWhenUsed="1"/>
+    <w:lsdException w:name="Smart Hyperlink" w:semiHidden="1" w:unhideWhenUsed="1"/>
+    <w:lsdException w:name="Hashtag" w:semiHidden="1" w:unhideWhenUsed="1"/>
+    <w:lsdException w:name="Unresolved Mention" w:semiHidden="1" w:unhideWhenUsed="1"/>
+    <w:lsdException w:name="Smart Link" w:semiHidden="1" w:unhideWhenUsed="1"/>
   </w:latentStyles>
   <w:style w:type="paragraph" w:default="1" w:styleId="Normal">
     <w:name w:val="Normal"/>
@@ -15926,6 +15976,7 @@
   <w:style w:type="character" w:default="1" w:styleId="DefaultParagraphFont">
     <w:name w:val="Default Paragraph Font"/>
     <w:uiPriority w:val="1"/>
+    <w:semiHidden/>
     <w:unhideWhenUsed/>
   </w:style>
   <w:style w:type="table" w:default="1" w:styleId="TableNormal">
@@ -15933,7 +15984,6 @@
     <w:uiPriority w:val="99"/>
     <w:semiHidden/>
     <w:unhideWhenUsed/>
-    <w:qFormat/>
     <w:tblPr>
       <w:tblInd w:w="0" w:type="dxa"/>
       <w:tblCellMar>

</xml_diff>